<commit_message>
Complete reviewer-required scientific diagnostics and manuscript results update.
Co-authored-by: Cursor <cursoragent@cursor.com>
</commit_message>
<xml_diff>
--- a/outputs/reviewer_revision/PUBLICATION_RESULTS_FINAL/ALNS-HCO-PAPER_RESULTS_REVISED.docx
+++ b/outputs/reviewer_revision/PUBLICATION_RESULTS_FINAL/ALNS-HCO-PAPER_RESULTS_REVISED.docx
@@ -25830,7 +25830,7 @@
           <w:rFonts w:ascii="Times New Roman" w:hAnsi="Times New Roman" w:cs="Times New Roman"/>
           <w:lang w:val="en-US"/>
         </w:rPr>
-        <w:t>Table 3 reports the overall routing performance of the baseline methods. The ALNS variants produce the smallest mean fleet sizes in both time-window regimes. Under Original TW, ALNS-FR obtains a mean fleet size of 69.96 and the shortest mean distance of 47,363.0, while ALNS-PR obtains the shortest mean route duration of 169,554.7. Under Relaxed TW, ALNS-FR and ALNS-PR again produce similar fleet and duration results, while VNS obtains the shortest mean travel distance. These results show that the two ALNS recharge policies provide comparable routing quality, making their charging-related differences particularly informative.</w:t>
+        <w:t>Table 3 reports the overall routing performance of the baseline methods. Under five stochastic seeds (0–4; GI deterministic), the ALNS variants produce the smallest mean fleet sizes in both time-window regimes. Under Original TW, ALNS-FR obtains a mean fleet size of 69.96 and the shortest mean distance of 47,363.0, while ALNS-PR obtains the shortest mean route duration of 169,554.7. Under Relaxed TW, ALNS-FR and ALNS-PR again produce similar fleet and duration results, while VNS obtains the shortest mean travel distance. These results show that the two ALNS recharge policies provide comparable routing quality, making their charging-related differences particularly informative.</w:t>
       </w:r>
     </w:p>
     <w:p>
@@ -28597,7 +28597,6 @@
           <w:iCs/>
           <w:lang w:val="en-US"/>
         </w:rPr>
-        <w:t xml:space="preserve">Figure 4. Effect of HCO Relative to the Matched Phase-II </w:t>
       </w:r>
       <w:proofErr w:type="spellStart"/>
       <w:r>
@@ -28607,7 +28606,6 @@
           <w:iCs/>
           <w:lang w:val="en-US"/>
         </w:rPr>
-        <w:t>NoHCO</w:t>
       </w:r>
       <w:proofErr w:type="spellEnd"/>
       <w:r>
@@ -28617,7 +28615,9 @@
           <w:iCs/>
           <w:lang w:val="en-US"/>
         </w:rPr>
-        <w:t xml:space="preserve"> Search</w:t>
+      </w:r>
+      <w:r>
+        <w:t>Figure 4. Effect of HCO Relative to the Matched Phase-II NoHCO Search. Five-seed paired percentages; negative means Heterogeneous is lower. Run-level charging-expense counts: 16 improved, 501 unchanged, 83 worsened.</w:t>
       </w:r>
     </w:p>
     <w:p>
@@ -28868,7 +28868,9 @@
           <w:iCs/>
           <w:lang w:val="en-US"/>
         </w:rPr>
-        <w:t>Figure 5. Family-Level Effect of Heterogeneous Charging Information</w:t>
+      </w:r>
+      <w:r>
+        <w:t>Figure 5. Family-Level Effect of HCO in the Matched Phase-II Search (charging expense %). Means only; C1 under Original TW can dominate the overall mean. See leave-one-family-out diagnostics.</w:t>
       </w:r>
     </w:p>
     <w:p>
@@ -31665,8 +31667,228 @@
       </w:pPr>
     </w:p>
     <w:p>
-      <w:r>
-        <w:t>Results tables/figures in this revision copy were cross-checked against five-seed Hanif outputs (solution_results.csv). PhaseII-Heterogeneous matched Phase I on K, distance, and charged energy in 584/600 matched cases. See PUBLICATION_RESULTS_FINAL/.</w:t>
+      <w:pPr>
+        <w:pStyle w:val="Titre1"/>
+      </w:pPr>
+      <w:r>
+        <w:t>Authoritative revised results annex (five-seed)</w:t>
+      </w:r>
+    </w:p>
+    <w:p>
+      <w:r>
+        <w:t>PhaseII-Heterogeneous matches Phase I on fleet size, distance, and charged energy in 584/600 matched five-seed cases. Matching aggregates does not prove identical routes. NoHCO→Heterogeneous charging expense shows many unchanged and some worsened runs; see HCO contribution tables. Schneider primary coverage remains 336 attempts with 264 feasible and 72 unsuccessful; longer 120 s diagnostics on hard instances are supplementary.</w:t>
+      </w:r>
+    </w:p>
+    <w:p>
+      <w:r>
+        <w:t>Figure 2 (regenerated from five-seed paired statistics).</w:t>
+      </w:r>
+    </w:p>
+    <w:p>
+      <w:r>
+        <w:drawing>
+          <wp:inline xmlns:a="http://schemas.openxmlformats.org/drawingml/2006/main" xmlns:pic="http://schemas.openxmlformats.org/drawingml/2006/picture">
+            <wp:extent cx="5760720" cy="2372852"/>
+            <wp:docPr id="1882027117" name="Picture 1882027117"/>
+            <wp:cNvGraphicFramePr>
+              <a:graphicFrameLocks noChangeAspect="1"/>
+            </wp:cNvGraphicFramePr>
+            <a:graphic>
+              <a:graphicData uri="http://schemas.openxmlformats.org/drawingml/2006/picture">
+                <pic:pic>
+                  <pic:nvPicPr>
+                    <pic:cNvPr id="0" name="Figure2_partial_recharging_FR_vs_PR.png"/>
+                    <pic:cNvPicPr/>
+                  </pic:nvPicPr>
+                  <pic:blipFill>
+                    <a:blip r:embed="rId13"/>
+                    <a:stretch>
+                      <a:fillRect/>
+                    </a:stretch>
+                  </pic:blipFill>
+                  <pic:spPr>
+                    <a:xfrm>
+                      <a:off x="0" y="0"/>
+                      <a:ext cx="5760720" cy="2372852"/>
+                    </a:xfrm>
+                    <a:prstGeom prst="rect"/>
+                  </pic:spPr>
+                </pic:pic>
+              </a:graphicData>
+            </a:graphic>
+          </wp:inline>
+        </w:drawing>
+      </w:r>
+    </w:p>
+    <w:p>
+      <w:r>
+        <w:t>Figure 3 (regenerated from five-seed paired statistics).</w:t>
+      </w:r>
+    </w:p>
+    <w:p>
+      <w:r>
+        <w:drawing>
+          <wp:inline xmlns:a="http://schemas.openxmlformats.org/drawingml/2006/main" xmlns:pic="http://schemas.openxmlformats.org/drawingml/2006/picture">
+            <wp:extent cx="5760720" cy="2384911"/>
+            <wp:docPr id="1882027118" name="Picture 1882027118"/>
+            <wp:cNvGraphicFramePr>
+              <a:graphicFrameLocks noChangeAspect="1"/>
+            </wp:cNvGraphicFramePr>
+            <a:graphic>
+              <a:graphicData uri="http://schemas.openxmlformats.org/drawingml/2006/picture">
+                <pic:pic>
+                  <pic:nvPicPr>
+                    <pic:cNvPr id="0" name="Figure3_fixed_route_Detour_vs_Het.png"/>
+                    <pic:cNvPicPr/>
+                  </pic:nvPicPr>
+                  <pic:blipFill>
+                    <a:blip r:embed="rId14"/>
+                    <a:stretch>
+                      <a:fillRect/>
+                    </a:stretch>
+                  </pic:blipFill>
+                  <pic:spPr>
+                    <a:xfrm>
+                      <a:off x="0" y="0"/>
+                      <a:ext cx="5760720" cy="2384911"/>
+                    </a:xfrm>
+                    <a:prstGeom prst="rect"/>
+                  </pic:spPr>
+                </pic:pic>
+              </a:graphicData>
+            </a:graphic>
+          </wp:inline>
+        </w:drawing>
+      </w:r>
+    </w:p>
+    <w:p>
+      <w:r/>
+      <w:r>
+        <w:t>Figure 4. Effect of HCO Relative to the Matched Phase-II NoHCO Search. Five-seed paired percentages; negative means Heterogeneous is lower. Run-level charging-expense counts: 16 improved, 501 unchanged, 83 worsened.</w:t>
+      </w:r>
+    </w:p>
+    <w:p>
+      <w:r>
+        <w:drawing>
+          <wp:inline xmlns:a="http://schemas.openxmlformats.org/drawingml/2006/main" xmlns:pic="http://schemas.openxmlformats.org/drawingml/2006/picture">
+            <wp:extent cx="5760720" cy="2384911"/>
+            <wp:docPr id="1882027119" name="Picture 1882027119"/>
+            <wp:cNvGraphicFramePr>
+              <a:graphicFrameLocks noChangeAspect="1"/>
+            </wp:cNvGraphicFramePr>
+            <a:graphic>
+              <a:graphicData uri="http://schemas.openxmlformats.org/drawingml/2006/picture">
+                <pic:pic>
+                  <pic:nvPicPr>
+                    <pic:cNvPr id="0" name="Figure4_PhaseII_NoHCO_vs_Heterogeneous.png"/>
+                    <pic:cNvPicPr/>
+                  </pic:nvPicPr>
+                  <pic:blipFill>
+                    <a:blip r:embed="rId15"/>
+                    <a:stretch>
+                      <a:fillRect/>
+                    </a:stretch>
+                  </pic:blipFill>
+                  <pic:spPr>
+                    <a:xfrm>
+                      <a:off x="0" y="0"/>
+                      <a:ext cx="5760720" cy="2384911"/>
+                    </a:xfrm>
+                    <a:prstGeom prst="rect"/>
+                  </pic:spPr>
+                </pic:pic>
+              </a:graphicData>
+            </a:graphic>
+          </wp:inline>
+        </w:drawing>
+      </w:r>
+    </w:p>
+    <w:p>
+      <w:r/>
+      <w:r>
+        <w:t>Figure 5. Family-Level Effect of HCO in the Matched Phase-II Search (charging expense %). Means only; C1 under Original TW can dominate the overall mean. See leave-one-family-out diagnostics.</w:t>
+      </w:r>
+    </w:p>
+    <w:p>
+      <w:r>
+        <w:drawing>
+          <wp:inline xmlns:a="http://schemas.openxmlformats.org/drawingml/2006/main" xmlns:pic="http://schemas.openxmlformats.org/drawingml/2006/picture">
+            <wp:extent cx="5760720" cy="2518065"/>
+            <wp:docPr id="1882027120" name="Picture 1882027120"/>
+            <wp:cNvGraphicFramePr>
+              <a:graphicFrameLocks noChangeAspect="1"/>
+            </wp:cNvGraphicFramePr>
+            <a:graphic>
+              <a:graphicData uri="http://schemas.openxmlformats.org/drawingml/2006/picture">
+                <pic:pic>
+                  <pic:nvPicPr>
+                    <pic:cNvPr id="0" name="Figure5_family_PhaseII_NoHCO_vs_Het_Cch.png"/>
+                    <pic:cNvPicPr/>
+                  </pic:nvPicPr>
+                  <pic:blipFill>
+                    <a:blip r:embed="rId16"/>
+                    <a:stretch>
+                      <a:fillRect/>
+                    </a:stretch>
+                  </pic:blipFill>
+                  <pic:spPr>
+                    <a:xfrm>
+                      <a:off x="0" y="0"/>
+                      <a:ext cx="5760720" cy="2518065"/>
+                    </a:xfrm>
+                    <a:prstGeom prst="rect"/>
+                  </pic:spPr>
+                </pic:pic>
+              </a:graphicData>
+            </a:graphic>
+          </wp:inline>
+        </w:drawing>
+      </w:r>
+    </w:p>
+    <w:p>
+      <w:r>
+        <w:t>Full CSV tables: outputs/reviewer_revision/PUBLICATION_RESULTS_FINAL/FINAL_TABLES/. Scientific audit: FINAL_SCIENTIFIC_AUDIT.md.</w:t>
+      </w:r>
+    </w:p>
+    <w:p>
+      <w:r>
+        <w:t>Supplementary Figure. Run-level charging-expense outcomes for PhaseII-NoHCO → Heterogeneous (five seeds).</w:t>
+      </w:r>
+    </w:p>
+    <w:p>
+      <w:r>
+        <w:drawing>
+          <wp:inline xmlns:a="http://schemas.openxmlformats.org/drawingml/2006/main" xmlns:pic="http://schemas.openxmlformats.org/drawingml/2006/picture">
+            <wp:extent cx="4572000" cy="2790078"/>
+            <wp:docPr id="1882027121" name="Picture 1882027121"/>
+            <wp:cNvGraphicFramePr>
+              <a:graphicFrameLocks noChangeAspect="1"/>
+            </wp:cNvGraphicFramePr>
+            <a:graphic>
+              <a:graphicData uri="http://schemas.openxmlformats.org/drawingml/2006/picture">
+                <pic:pic>
+                  <pic:nvPicPr>
+                    <pic:cNvPr id="0" name="FigureS_HCO_NoHCO_vs_Het_Cch_counts.png"/>
+                    <pic:cNvPicPr/>
+                  </pic:nvPicPr>
+                  <pic:blipFill>
+                    <a:blip r:embed="rId17"/>
+                    <a:stretch>
+                      <a:fillRect/>
+                    </a:stretch>
+                  </pic:blipFill>
+                  <pic:spPr>
+                    <a:xfrm>
+                      <a:off x="0" y="0"/>
+                      <a:ext cx="4572000" cy="2790078"/>
+                    </a:xfrm>
+                    <a:prstGeom prst="rect"/>
+                  </pic:spPr>
+                </pic:pic>
+              </a:graphicData>
+            </a:graphic>
+          </wp:inline>
+        </w:drawing>
       </w:r>
     </w:p>
     <w:sectPr>

</xml_diff>

<commit_message>
Complete final scientific QC: Schneider hard-customer and full-matrix fidelity, policy-experiment re-verification, integrated Word Results with PDF, and readiness report.
Co-authored-by: Cursor <cursoragent@cursor.com>
</commit_message>
<xml_diff>
--- a/outputs/reviewer_revision/PUBLICATION_RESULTS_FINAL/ALNS-HCO-PAPER_RESULTS_REVISED.docx
+++ b/outputs/reviewer_revision/PUBLICATION_RESULTS_FINAL/ALNS-HCO-PAPER_RESULTS_REVISED.docx
@@ -69,7 +69,7 @@
           <w:rFonts w:ascii="Times New Roman" w:hAnsi="Times New Roman" w:cs="Times New Roman"/>
           <w:lang w:val="en-US"/>
         </w:rPr>
-        <w:t xml:space="preserve">Electric vehicle </w:t>
+        <w:t>Electric vehicle routing becomes more complicated when customer time windows must be respected and vehicles also need to decide when and where to recharge. The problem becomes even more challenging when charging stations differ in electricity price, expected waiting time, and charging rate. This study investigates how these station differences, together with the amount of energy charged at each stop, affect large-scale electric vehicle routing with time windows. To address this problem, we use a two-phase Adaptive Large Neighborhood Search framework with a Heterogeneous Charging Oracle. The first phase focuses on constructing feasible routes and determining the fleet size while allowing partial recharging. In the second phase, the fleet size remains fixed, while customer routes and charging decisions are further improved using information on station price, waiting time, and charging rate. The approach is tested on 120 large instances with 1,000 customers, covering clustered, random, and mixed customer distributions under both original and relaxed time windows. The experiments are designed to separate the effect of partial recharging from the effects of heterogeneous station selection and charging-aware rerouting. The results show that partial recharging has the largest and most consistent effect, reducing charging expense by about 26.8% under original time windows and 12.6% under relaxed time windows, while also reducing charged energy and charging time. The benefit of heterogeneous station information is smaller and depends more strongly on the structure of the instance. It is most noticeable under tighter time windows and in some instance families. Overall, the results show that charging quantity, station characteristics, and routing decisions affect solution performance in different ways and should therefore be examined separately. Experiments use five random seeds on the Hanif benchmark. Partial recharging reduces public charging expense but can increase distance and propulsion energy. HCO improvements are limited and concentrated (notably C1 Original TW) and can worsen charging expense relative to NoHCO. External Schneider validation and a controlled same-route recharge-policy study are reported with explicit limitations.</w:t>
       </w:r>
       <w:proofErr w:type="gramStart"/>
       <w:r>
@@ -77,7 +77,6 @@
           <w:rFonts w:ascii="Times New Roman" w:hAnsi="Times New Roman" w:cs="Times New Roman"/>
           <w:lang w:val="en-US"/>
         </w:rPr>
-        <w:t>routing</w:t>
       </w:r>
       <w:proofErr w:type="gramEnd"/>
       <w:r>
@@ -85,7 +84,6 @@
           <w:rFonts w:ascii="Times New Roman" w:hAnsi="Times New Roman" w:cs="Times New Roman"/>
           <w:lang w:val="en-US"/>
         </w:rPr>
-        <w:t xml:space="preserve"> becomes more complicated when customer time windows must be </w:t>
       </w:r>
       <w:proofErr w:type="gramStart"/>
       <w:r>
@@ -93,7 +91,6 @@
           <w:rFonts w:ascii="Times New Roman" w:hAnsi="Times New Roman" w:cs="Times New Roman"/>
           <w:lang w:val="en-US"/>
         </w:rPr>
-        <w:t>respected</w:t>
       </w:r>
       <w:proofErr w:type="gramEnd"/>
       <w:r>
@@ -101,7 +98,6 @@
           <w:rFonts w:ascii="Times New Roman" w:hAnsi="Times New Roman" w:cs="Times New Roman"/>
           <w:lang w:val="en-US"/>
         </w:rPr>
-        <w:t xml:space="preserve"> and vehicles also need to decide when and where to recharge. The problem becomes even more challenging when charging stations differ in electricity price, expected waiting time, and charging rate. This study investigates how these station differences, together with the amount of energy charged at each stop, affect large-scale electric </w:t>
       </w:r>
       <w:proofErr w:type="gramStart"/>
       <w:r>
@@ -109,7 +105,6 @@
           <w:rFonts w:ascii="Times New Roman" w:hAnsi="Times New Roman" w:cs="Times New Roman"/>
           <w:lang w:val="en-US"/>
         </w:rPr>
-        <w:t>vehicle</w:t>
       </w:r>
       <w:proofErr w:type="gramEnd"/>
       <w:r>
@@ -117,7 +112,6 @@
           <w:rFonts w:ascii="Times New Roman" w:hAnsi="Times New Roman" w:cs="Times New Roman"/>
           <w:lang w:val="en-US"/>
         </w:rPr>
-        <w:t xml:space="preserve"> routing with time windows. To address this problem, we use a two-phase Adaptive Large Neighborhood Search framework with a Heterogeneous Charging Oracle. The first phase focuses on constructing feasible routes and determining the fleet size while allowing partial recharging. In the second phase, the fleet size remains fixed, while customer routes and charging decisions are further improved using information on station price, waiting time, and charging rate. The approach is tested on 120 large instances with 1,000 customers, covering clustered, random, and mixed customer distributions under both original and relaxed time windows. The experiments are designed to separate the effect of partial recharging from the effects of heterogeneous station selection and charging-aware rerouting. The results show that partial recharging has the largest and most consistent effect, reducing charging expense by about 26.8% under original time windows and 12.6% under relaxed time windows, while also reducing charged energy and charging time. The benefit of heterogeneous station information is smaller and depends more strongly on the structure of the instance. It is most noticeable under tighter time windows and in some instance families. Overall, the results show that charging quantity, station characteristics, and routing decisions affect solution performance in different ways and should therefore be examined separately.</w:t>
       </w:r>
     </w:p>
     <w:p>
@@ -25830,7 +25824,7 @@
           <w:rFonts w:ascii="Times New Roman" w:hAnsi="Times New Roman" w:cs="Times New Roman"/>
           <w:lang w:val="en-US"/>
         </w:rPr>
-        <w:t>Table 3 reports the overall routing performance of the baseline methods. Under five seeds (0–4; GI deterministic), the ALNS variants produce the smallest mean fleet sizes in both time-window regimes. Under Original TW, ALNS-FR obtains a mean fleet size of 69.96 and the shortest mean distance of 47,363.0, while ALNS-PR obtains the shortest mean route duration of 169,554.7. Under Relaxed TW, ALNS-FR and ALNS-PR again produce similar fleet and duration results, while VNS obtains the shortest mean travel distance. These results show that the two ALNS recharge policies provide comparable routing quality, making their charging-related differences particularly informative.</w:t>
+        <w:t>Table 3 reports the overall routing performance of the baseline methods. The ALNS variants produce the smallest mean fleet sizes in both time-window regimes. Under Original TW, ALNS-FR obtains a mean fleet size of 69.96 and the shortest mean distance of 47,363.0, while ALNS-PR obtains the shortest mean route duration of 169,554.7. Under Relaxed TW, ALNS-FR and ALNS-PR again produce similar fleet and duration results, while VNS obtains the shortest mean travel distance. These results show that the two ALNS recharge policies provide comparable routing quality, making their charging-related differences particularly informative.</w:t>
       </w:r>
     </w:p>
     <w:p>
@@ -27052,21 +27046,19 @@
           <w:rFonts w:ascii="Times New Roman" w:hAnsi="Times New Roman" w:cs="Times New Roman"/>
           <w:lang w:val="en-US"/>
         </w:rPr>
-        <w:t xml:space="preserve">The direct comparison between ALNS-FR and ALNS-PR shows that the main benefit of partial recharging appears in </w:t>
-      </w:r>
-      <w:r>
-        <w:rPr>
-          <w:rFonts w:ascii="Times New Roman" w:hAnsi="Times New Roman" w:cs="Times New Roman"/>
-          <w:lang w:val="en-US"/>
-        </w:rPr>
-        <w:t>charging performance rather than in travel distance. Under Original TW, partial recharging reduces mean paired charged energy by 26.01%, charging time by 25.43%, and charging expense by 26.82%. Their 95% confidence intervals are</w:t>
-      </w:r>
-      <w:r>
-        <w:rPr>
-          <w:rFonts w:ascii="Times New Roman" w:hAnsi="Times New Roman" w:cs="Times New Roman"/>
-          <w:lang w:val="en-US"/>
-        </w:rPr>
-        <w:t xml:space="preserve"> </w:t>
+        <w:t>The direct comparison between ALNS-FR and ALNS-PR shows that the main benefit of partial recharging appears in charging performance rather than in travel distance. Under Original TW (five seeds), mean paired changes are distance +3.34%, charged energy -26.01%, charging time -25.43%, and charging expense -26.82%. PR therefore reduces public charging purchases but can increase route distance and total propulsion energy. ALNS-FR and ALNS-PR use different search implementations (care-fi ALNS vs Phase-I PR operators); they are not a pure recharge-policy ablation. Under Original TW, partial recharging reduces mean paired charged energy by 26.01%, charging time by 25.43%, and charging expense by 26.82%. Their 95% confidence intervals are , , and , respectively. Charging visits decrease by 20.62% and expected station waiting by 22.39%. These gains are accompanied by a 3.34% increase in travel distance, while total route duration decreases slightly by 0.93%.</w:t>
+      </w:r>
+      <w:r>
+        <w:rPr>
+          <w:rFonts w:ascii="Times New Roman" w:hAnsi="Times New Roman" w:cs="Times New Roman"/>
+          <w:lang w:val="en-US"/>
+        </w:rPr>
+      </w:r>
+      <w:r>
+        <w:rPr>
+          <w:rFonts w:ascii="Times New Roman" w:hAnsi="Times New Roman" w:cs="Times New Roman"/>
+          <w:lang w:val="en-US"/>
+        </w:rPr>
       </w:r>
       <m:oMath>
         <m:d>
@@ -27105,7 +27097,6 @@
           <w:rFonts w:ascii="Times New Roman" w:hAnsi="Times New Roman" w:cs="Times New Roman"/>
           <w:lang w:val="en-US"/>
         </w:rPr>
-        <w:t xml:space="preserve">, </w:t>
       </w:r>
       <m:oMath>
         <m:d>
@@ -27144,7 +27135,6 @@
           <w:rFonts w:ascii="Times New Roman" w:hAnsi="Times New Roman" w:cs="Times New Roman"/>
           <w:lang w:val="en-US"/>
         </w:rPr>
-        <w:t xml:space="preserve">, and </w:t>
       </w:r>
       <m:oMath>
         <m:d>
@@ -27183,7 +27173,6 @@
           <w:rFonts w:ascii="Times New Roman" w:hAnsi="Times New Roman" w:cs="Times New Roman"/>
           <w:lang w:val="en-US"/>
         </w:rPr>
-        <w:t xml:space="preserve">, respectively. Charging visits </w:t>
       </w:r>
       <w:proofErr w:type="gramStart"/>
       <w:r>
@@ -27191,7 +27180,6 @@
           <w:rFonts w:ascii="Times New Roman" w:hAnsi="Times New Roman" w:cs="Times New Roman"/>
           <w:lang w:val="en-US"/>
         </w:rPr>
-        <w:t>decrease</w:t>
       </w:r>
       <w:proofErr w:type="gramEnd"/>
       <w:r>
@@ -27199,7 +27187,6 @@
           <w:rFonts w:ascii="Times New Roman" w:hAnsi="Times New Roman" w:cs="Times New Roman"/>
           <w:lang w:val="en-US"/>
         </w:rPr>
-        <w:t xml:space="preserve"> by 20.62% and expected station waiting by 22.39%. These gains are accompanied by a 3.34% increase in travel distance, while total route duration decreases slightly by 0.93%.</w:t>
       </w:r>
     </w:p>
     <w:p>
@@ -27215,7 +27202,7 @@
           <w:rFonts w:ascii="Times New Roman" w:hAnsi="Times New Roman" w:cs="Times New Roman"/>
           <w:lang w:val="en-US"/>
         </w:rPr>
-        <w:t xml:space="preserve">Under Relaxed TW, the same pattern remains but is weaker. Charged energy decreases by 11.52%, charging time by 10.74%, and charging expense by 12.62%, with all three confidence intervals remaining below zero. Charging visits </w:t>
+        <w:t>Under Relaxed TW, the same pattern remains but is weaker. Charged energy changes by -11.52%, charging time by -10.74%, and charging expense by -12.62%; distance changes by +3.37% (instance-level paired means, five seeds).</w:t>
       </w:r>
       <w:proofErr w:type="gramStart"/>
       <w:r>
@@ -27223,7 +27210,6 @@
           <w:rFonts w:ascii="Times New Roman" w:hAnsi="Times New Roman" w:cs="Times New Roman"/>
           <w:lang w:val="en-US"/>
         </w:rPr>
-        <w:t>decrease</w:t>
       </w:r>
       <w:proofErr w:type="gramEnd"/>
       <w:r>
@@ -27231,14 +27217,12 @@
           <w:rFonts w:ascii="Times New Roman" w:hAnsi="Times New Roman" w:cs="Times New Roman"/>
           <w:lang w:val="en-US"/>
         </w:rPr>
-        <w:t xml:space="preserve"> by 13.88% and expected station waiting by 15.41%. Travel distance increases by 3.37%, whereas the</w:t>
-      </w:r>
-      <w:r>
-        <w:rPr>
-          <w:rFonts w:ascii="Times New Roman" w:hAnsi="Times New Roman" w:cs="Times New Roman"/>
-          <w:lang w:val="en-US"/>
-        </w:rPr>
-        <w:t xml:space="preserve"> change in total route duration is only 0.07% and its confidence interval includes zero.</w:t>
+      </w:r>
+      <w:r>
+        <w:rPr>
+          <w:rFonts w:ascii="Times New Roman" w:hAnsi="Times New Roman" w:cs="Times New Roman"/>
+          <w:lang w:val="en-US"/>
+        </w:rPr>
       </w:r>
     </w:p>
     <w:p>
@@ -27319,7 +27303,7 @@
           <w:iCs/>
           <w:lang w:val="en-US"/>
         </w:rPr>
-        <w:t>Figure 2. Effect of Partial Recharging on Routing and Charging Performance. Paired ALNS-FR → ALNS-PR percentage changes (five seeds). Negative means PR is lower. Primary FR/PR also differ in search operators; see fairness audit and controlled same-route policy experiment.</w:t>
+        <w:t>Figure 2. Effect of Partial Recharging on Routing and Charging Performance. Paired ALNS-FR → ALNS-PR percentage changes (five seeds 0–4). Negative means PR is lower. ALNS-FR and ALNS-PR also differ in destroy/repair implementations; see fairness audit. Original TW: distance +3.34%, charged energy -26.01%, charging expense -26.82%.</w:t>
       </w:r>
     </w:p>
     <w:p>
@@ -27467,7 +27451,7 @@
           <w:rFonts w:ascii="Times New Roman" w:hAnsi="Times New Roman" w:cs="Times New Roman"/>
           <w:lang w:val="en-US"/>
         </w:rPr>
-        <w:t xml:space="preserve">Under Original TW, heterogeneous HCO reduces </w:t>
+        <w:t>Under Original TW, heterogeneous HCO reduces mean paired charging expense by -0.37% and expected station waiting by -1.25%. Charging time changes by +0.78%, while the number of charging visits remains unchanged. These are small average effects on fixed Phase-I customer routes.</w:t>
       </w:r>
       <w:proofErr w:type="gramStart"/>
       <w:r>
@@ -27475,7 +27459,6 @@
           <w:rFonts w:ascii="Times New Roman" w:hAnsi="Times New Roman" w:cs="Times New Roman"/>
           <w:lang w:val="en-US"/>
         </w:rPr>
-        <w:t>mean</w:t>
       </w:r>
       <w:proofErr w:type="gramEnd"/>
       <w:r>
@@ -27483,7 +27466,6 @@
           <w:rFonts w:ascii="Times New Roman" w:hAnsi="Times New Roman" w:cs="Times New Roman"/>
           <w:lang w:val="en-US"/>
         </w:rPr>
-        <w:t xml:space="preserve"> paired charging expense by </w:t>
       </w:r>
       <m:oMath>
         <m:r>
@@ -27499,7 +27481,6 @@
           <w:rFonts w:ascii="Times New Roman" w:hAnsi="Times New Roman" w:cs="Times New Roman"/>
           <w:lang w:val="en-US"/>
         </w:rPr>
-        <w:t xml:space="preserve">and expected station waiting by </w:t>
       </w:r>
       <m:oMath>
         <m:r>
@@ -27515,7 +27496,6 @@
           <w:rFonts w:ascii="Times New Roman" w:hAnsi="Times New Roman" w:cs="Times New Roman"/>
           <w:lang w:val="en-US"/>
         </w:rPr>
-        <w:t xml:space="preserve">. Charging time increases by </w:t>
       </w:r>
       <m:oMath>
         <m:r>
@@ -27531,7 +27511,6 @@
           <w:rFonts w:ascii="Times New Roman" w:hAnsi="Times New Roman" w:cs="Times New Roman"/>
           <w:lang w:val="en-US"/>
         </w:rPr>
-        <w:t>, while the number of charging visits remains unchanged. The difference is concentrated in only 7 of the 60 instances; the remaining 53 instances produce the same charging plan. Under Relaxed TW, the two HCO variants give identical results on all 60 instances.</w:t>
       </w:r>
     </w:p>
     <w:p>
@@ -27608,7 +27587,7 @@
           <w:iCs/>
           <w:lang w:val="en-US"/>
         </w:rPr>
-        <w:t>Figure 3. Fixed-Route Effect of Heterogeneous Charging Information. FixedRoute-HCO-Detour → Heterogeneous on identical Phase-I customer routes (five seeds).</w:t>
+        <w:t>Figure 3. Fixed-Route Effect of Heterogeneous Charging Information. FixedRoute-HCO-Detour → Heterogeneous on identical Phase-I customer routes (five seeds). Original TW charging expense -0.37%, waiting -1.25%.</w:t>
       </w:r>
     </w:p>
     <w:p>
@@ -28387,7 +28366,7 @@
           <w:rFonts w:ascii="Times New Roman" w:hAnsi="Times New Roman" w:cs="Times New Roman"/>
           <w:lang w:val="en-US"/>
         </w:rPr>
-        <w:t xml:space="preserve">A second comparison measures whether HCO adds value beyond the same Phase-II search. </w:t>
+        <w:t>A second comparison measures whether HCO adds value beyond the same Phase-II search. PhaseII-NoHCO and PhaseII-Heterogeneous use the same starting solution, fleet size, operators, search budget, and acceptance rules; the main difference is the use of heterogeneous HCO during repair. Under Original TW (five seeds), HCO changes mean paired charging expense by -3.66%, expected station waiting by -3.04%, and charging time by -1.56%, while travel distance is almost unchanged (-0.01%). Run-level charging-expense outcomes across both TW regimes are 16 improved, 501 unchanged, and 83 worsened.</w:t>
       </w:r>
       <w:proofErr w:type="spellStart"/>
       <w:r>
@@ -28395,7 +28374,6 @@
           <w:rFonts w:ascii="Times New Roman" w:hAnsi="Times New Roman" w:cs="Times New Roman"/>
           <w:lang w:val="en-US"/>
         </w:rPr>
-        <w:t>PhaseII-NoHCO</w:t>
       </w:r>
       <w:proofErr w:type="spellEnd"/>
       <w:r>
@@ -28403,7 +28381,6 @@
           <w:rFonts w:ascii="Times New Roman" w:hAnsi="Times New Roman" w:cs="Times New Roman"/>
           <w:lang w:val="en-US"/>
         </w:rPr>
-        <w:t xml:space="preserve"> and </w:t>
       </w:r>
       <w:proofErr w:type="spellStart"/>
       <w:r>
@@ -28411,7 +28388,6 @@
           <w:rFonts w:ascii="Times New Roman" w:hAnsi="Times New Roman" w:cs="Times New Roman"/>
           <w:lang w:val="en-US"/>
         </w:rPr>
-        <w:t>PhaseII</w:t>
       </w:r>
       <w:proofErr w:type="spellEnd"/>
       <w:r>
@@ -28419,7 +28395,6 @@
           <w:rFonts w:ascii="Times New Roman" w:hAnsi="Times New Roman" w:cs="Times New Roman"/>
           <w:lang w:val="en-US"/>
         </w:rPr>
-        <w:t xml:space="preserve">-Heterogeneous use the same starting solution, fleet size, operators, search budget, and acceptance rules; the main difference is the use of heterogeneous HCO during repair. Under Original TW, HCO reduces mean paired charging expense by </w:t>
       </w:r>
       <m:oMath>
         <m:r>
@@ -28435,7 +28410,6 @@
           <w:rFonts w:ascii="Times New Roman" w:hAnsi="Times New Roman" w:cs="Times New Roman"/>
           <w:lang w:val="en-US"/>
         </w:rPr>
-        <w:t xml:space="preserve">, expected station waiting by </w:t>
       </w:r>
       <m:oMath>
         <m:r>
@@ -28451,7 +28425,6 @@
           <w:rFonts w:ascii="Times New Roman" w:hAnsi="Times New Roman" w:cs="Times New Roman"/>
           <w:lang w:val="en-US"/>
         </w:rPr>
-        <w:t xml:space="preserve">, and charging time by </w:t>
       </w:r>
       <m:oMath>
         <m:r>
@@ -28467,7 +28440,6 @@
           <w:rFonts w:ascii="Times New Roman" w:hAnsi="Times New Roman" w:cs="Times New Roman"/>
           <w:lang w:val="en-US"/>
         </w:rPr>
-        <w:t>, while travel distance is almost unchanged.</w:t>
       </w:r>
     </w:p>
     <w:p>
@@ -28483,8 +28455,7 @@
           <w:rFonts w:ascii="Times New Roman" w:hAnsi="Times New Roman" w:cs="Times New Roman"/>
           <w:lang w:val="en-US"/>
         </w:rPr>
-        <w:lastRenderedPageBreak/>
-        <w:t xml:space="preserve">These gains are not uniform across the benchmark. For charging </w:t>
+        <w:t>These gains are not uniform across the benchmark. At the run level (both TW regimes), NoHCO→Heterogeneous charging expense improves in 16 runs, is unchanged in 501, and worsens in 83; the median paired change is zero. Instance-level favorable means are strongly concentrated in C1 under Original TW; on Relaxed TW, HCO can perform worse than NoHCO on average in some families. PhaseII-Heterogeneous matches Phase I on fleet size, distance and charged energy in 584/600 matched runs (route identity is not claimed from aggregate matches). HCO candidate count five is a fixed design choice; a development sensitivity over {2,5,8} produced identical solution metrics and does not prove optimality.</w:t>
       </w:r>
       <w:proofErr w:type="gramStart"/>
       <w:r>
@@ -28492,7 +28463,6 @@
           <w:rFonts w:ascii="Times New Roman" w:hAnsi="Times New Roman" w:cs="Times New Roman"/>
           <w:lang w:val="en-US"/>
         </w:rPr>
-        <w:t>expense</w:t>
       </w:r>
       <w:proofErr w:type="gramEnd"/>
       <w:r>
@@ -28500,7 +28470,6 @@
           <w:rFonts w:ascii="Times New Roman" w:hAnsi="Times New Roman" w:cs="Times New Roman"/>
           <w:lang w:val="en-US"/>
         </w:rPr>
-        <w:t xml:space="preserve">, HCO improves 8 instances, ties on 29, and worsens 23, while the median paired change is zero. The negative mean is therefore driven by a limited set of instances with comparatively large improvements. </w:t>
       </w:r>
       <w:proofErr w:type="gramStart"/>
       <w:r>
@@ -28508,7 +28477,6 @@
           <w:rFonts w:ascii="Times New Roman" w:hAnsi="Times New Roman" w:cs="Times New Roman"/>
           <w:lang w:val="en-US"/>
         </w:rPr>
-        <w:t>Under</w:t>
       </w:r>
       <w:proofErr w:type="gramEnd"/>
       <w:r>
@@ -28516,21 +28484,18 @@
           <w:rFonts w:ascii="Times New Roman" w:hAnsi="Times New Roman" w:cs="Times New Roman"/>
           <w:lang w:val="en-US"/>
         </w:rPr>
-        <w:t xml:space="preserve"> Relaxed TW, HCO provides no overall benefit</w:t>
-      </w:r>
-      <w:r>
-        <w:rPr>
-          <w:rFonts w:ascii="Times New Roman" w:hAnsi="Times New Roman" w:cs="Times New Roman"/>
-          <w:lang w:val="en-US"/>
-        </w:rPr>
-        <w:t>,</w:t>
-      </w:r>
-      <w:r>
-        <w:rPr>
-          <w:rFonts w:ascii="Times New Roman" w:hAnsi="Times New Roman" w:cs="Times New Roman"/>
-          <w:lang w:val="en-US"/>
-        </w:rPr>
-        <w:t xml:space="preserve"> charging </w:t>
+      </w:r>
+      <w:r>
+        <w:rPr>
+          <w:rFonts w:ascii="Times New Roman" w:hAnsi="Times New Roman" w:cs="Times New Roman"/>
+          <w:lang w:val="en-US"/>
+        </w:rPr>
+      </w:r>
+      <w:r>
+        <w:rPr>
+          <w:rFonts w:ascii="Times New Roman" w:hAnsi="Times New Roman" w:cs="Times New Roman"/>
+          <w:lang w:val="en-US"/>
+        </w:rPr>
       </w:r>
       <w:proofErr w:type="gramStart"/>
       <w:r>
@@ -28538,7 +28503,6 @@
           <w:rFonts w:ascii="Times New Roman" w:hAnsi="Times New Roman" w:cs="Times New Roman"/>
           <w:lang w:val="en-US"/>
         </w:rPr>
-        <w:t>expense</w:t>
       </w:r>
       <w:proofErr w:type="gramEnd"/>
       <w:r>
@@ -28546,7 +28510,6 @@
           <w:rFonts w:ascii="Times New Roman" w:hAnsi="Times New Roman" w:cs="Times New Roman"/>
           <w:lang w:val="en-US"/>
         </w:rPr>
-        <w:t xml:space="preserve"> increases slightly by </w:t>
       </w:r>
       <m:oMath>
         <m:r>
@@ -28562,7 +28525,6 @@
           <w:rFonts w:ascii="Times New Roman" w:hAnsi="Times New Roman" w:cs="Times New Roman"/>
           <w:lang w:val="en-US"/>
         </w:rPr>
-        <w:t>, and the changes in the other charging measures are also small.</w:t>
       </w:r>
     </w:p>
     <w:p>
@@ -28639,7 +28601,7 @@
           <w:iCs/>
           <w:lang w:val="en-US"/>
         </w:rPr>
-        <w:t>Figure 4. Effect of HCO Relative to the Matched Phase-II NoHCO Search (five seeds). Run-level charging-expense outcomes: 16 improved, 501 unchanged, 83 worsened. Favorable means can coexist with many non-improvements.</w:t>
+        <w:t>Figure 4. Effect of HCO Relative to the Matched Phase-II NoHCO Search (five seeds). Run-level charging-expense outcomes: 16 improved, 501 unchanged, 83 worsened. Favorable means can coexist with many non-improvements; C1 Original TW concentrates gains.</w:t>
       </w:r>
       <w:proofErr w:type="spellStart"/>
       <w:r>
@@ -28709,7 +28671,7 @@
           <w:rFonts w:ascii="Times New Roman" w:hAnsi="Times New Roman" w:cs="Times New Roman"/>
           <w:lang w:val="en-US"/>
         </w:rPr>
-        <w:t xml:space="preserve">A further comparison between </w:t>
+        <w:t>A further comparison between PhaseII-Detour and PhaseII-Heterogeneous gives a similar result. Under Original TW, heterogeneous station selection changes charging expense by -0.53% and expected waiting by -1.63%, whereas the two variants are essentially identical under Relaxed TW for most families. Overall, heterogeneous charging information has a measurable but selective effect rather than a uniform benefit across all instances.</w:t>
       </w:r>
       <w:proofErr w:type="spellStart"/>
       <w:r>
@@ -28717,7 +28679,6 @@
           <w:rFonts w:ascii="Times New Roman" w:hAnsi="Times New Roman" w:cs="Times New Roman"/>
           <w:lang w:val="en-US"/>
         </w:rPr>
-        <w:t>PhaseII</w:t>
       </w:r>
       <w:proofErr w:type="spellEnd"/>
       <w:r>
@@ -28725,7 +28686,6 @@
           <w:rFonts w:ascii="Times New Roman" w:hAnsi="Times New Roman" w:cs="Times New Roman"/>
           <w:lang w:val="en-US"/>
         </w:rPr>
-        <w:t xml:space="preserve">-Detour and </w:t>
       </w:r>
       <w:proofErr w:type="spellStart"/>
       <w:r>
@@ -28733,7 +28693,6 @@
           <w:rFonts w:ascii="Times New Roman" w:hAnsi="Times New Roman" w:cs="Times New Roman"/>
           <w:lang w:val="en-US"/>
         </w:rPr>
-        <w:t>PhaseII</w:t>
       </w:r>
       <w:proofErr w:type="spellEnd"/>
       <w:r>
@@ -28741,7 +28700,6 @@
           <w:rFonts w:ascii="Times New Roman" w:hAnsi="Times New Roman" w:cs="Times New Roman"/>
           <w:lang w:val="en-US"/>
         </w:rPr>
-        <w:t xml:space="preserve">-Heterogeneous gives a similar result. Under Original TW, heterogeneous station selection reduces charging expense by </w:t>
       </w:r>
       <m:oMath>
         <m:r>
@@ -28757,7 +28715,6 @@
           <w:rFonts w:ascii="Times New Roman" w:hAnsi="Times New Roman" w:cs="Times New Roman"/>
           <w:lang w:val="en-US"/>
         </w:rPr>
-        <w:t xml:space="preserve">and expected waiting by </w:t>
       </w:r>
       <m:oMath>
         <m:r>
@@ -28773,7 +28730,6 @@
           <w:rFonts w:ascii="Times New Roman" w:hAnsi="Times New Roman" w:cs="Times New Roman"/>
           <w:lang w:val="en-US"/>
         </w:rPr>
-        <w:t>, whereas the two variants are identical under Relaxed TW. Overall, heterogeneous charging information has a measurable but selective effect rather than a uniform benefit across all instances.</w:t>
       </w:r>
     </w:p>
     <w:p>
@@ -28818,7 +28774,7 @@
           <w:rFonts w:ascii="Times New Roman" w:hAnsi="Times New Roman" w:cs="Times New Roman"/>
           <w:lang w:val="en-US"/>
         </w:rPr>
-        <w:t xml:space="preserve">The aggregate results hide clear differences among the six benchmark families. For the fixed-route heterogeneity comparison, Original C1 is the most responsive family. HCO-Heterogeneous reduces charging expense by </w:t>
+        <w:t>The aggregate results hide clear differences among the six benchmark families. For the fixed-route heterogeneity comparison, Original C1 is the most responsive family. HCO-Heterogeneous changes charging expense by -2.04% and expected waiting by -6.66% relative to HCO-Detour, although charging time increases by +4.39%. C2 and R1 show much smaller changes, while R2, RC1, and RC2 show no measurable fixed-route effect. Under Relaxed TW, all six families produce the same result for the two HCO variants.</w:t>
       </w:r>
       <m:oMath>
         <m:r>
@@ -28834,7 +28790,6 @@
           <w:rFonts w:ascii="Times New Roman" w:hAnsi="Times New Roman" w:cs="Times New Roman"/>
           <w:lang w:val="en-US"/>
         </w:rPr>
-        <w:t xml:space="preserve">and expected waiting by </w:t>
       </w:r>
       <m:oMath>
         <m:r>
@@ -28850,7 +28805,6 @@
           <w:rFonts w:ascii="Times New Roman" w:hAnsi="Times New Roman" w:cs="Times New Roman"/>
           <w:lang w:val="en-US"/>
         </w:rPr>
-        <w:t xml:space="preserve">relative to HCO-Detour, although charging time increases by </w:t>
       </w:r>
       <m:oMath>
         <m:r>
@@ -28866,7 +28820,6 @@
           <w:rFonts w:ascii="Times New Roman" w:hAnsi="Times New Roman" w:cs="Times New Roman"/>
           <w:lang w:val="en-US"/>
         </w:rPr>
-        <w:t>. C2 and R1 show much smaller changes, while R2, RC1, and RC2 show no measurable fixed-route effect. Under Relaxed TW, all six families produce the same result for the two HCO variants.</w:t>
       </w:r>
     </w:p>
     <w:p>
@@ -28996,7 +28949,7 @@
           <w:rFonts w:ascii="Times New Roman" w:hAnsi="Times New Roman" w:cs="Times New Roman"/>
           <w:lang w:val="en-US"/>
         </w:rPr>
-        <w:t xml:space="preserve">The matched </w:t>
+        <w:t>The matched PhaseII-NoHCO comparison shows an even stronger concentration of the HCO benefit in Original C1. Charging expense decreases by about -21.00% for C1, compared with -1.07% for C2 and -0.79% for R1. R2 and RC2 show essentially no change, while RC1 increases slightly (+0.92%). Under Relaxed TW, none of the families obtains a meaningful reduction in charging expense; C1 even worsens by about +1.42% on average.</w:t>
       </w:r>
       <w:proofErr w:type="spellStart"/>
       <w:r>
@@ -29004,7 +28957,6 @@
           <w:rFonts w:ascii="Times New Roman" w:hAnsi="Times New Roman" w:cs="Times New Roman"/>
           <w:lang w:val="en-US"/>
         </w:rPr>
-        <w:t>PhaseII-NoHCO</w:t>
       </w:r>
       <w:proofErr w:type="spellEnd"/>
       <w:r>
@@ -29012,7 +28964,6 @@
           <w:rFonts w:ascii="Times New Roman" w:hAnsi="Times New Roman" w:cs="Times New Roman"/>
           <w:lang w:val="en-US"/>
         </w:rPr>
-        <w:t xml:space="preserve"> comparison shows an even stronger concentration of the HCO benefit in Original C1. Charging expense decreases by about </w:t>
       </w:r>
       <m:oMath>
         <m:r>
@@ -29028,7 +28979,6 @@
           <w:rFonts w:ascii="Times New Roman" w:hAnsi="Times New Roman" w:cs="Times New Roman"/>
           <w:lang w:val="en-US"/>
         </w:rPr>
-        <w:t xml:space="preserve">for C1, compared with only </w:t>
       </w:r>
       <m:oMath>
         <m:r>
@@ -29044,7 +28994,6 @@
           <w:rFonts w:ascii="Times New Roman" w:hAnsi="Times New Roman" w:cs="Times New Roman"/>
           <w:lang w:val="en-US"/>
         </w:rPr>
-        <w:t xml:space="preserve">for C2 and </w:t>
       </w:r>
       <m:oMath>
         <m:r>
@@ -29060,7 +29009,6 @@
           <w:rFonts w:ascii="Times New Roman" w:hAnsi="Times New Roman" w:cs="Times New Roman"/>
           <w:lang w:val="en-US"/>
         </w:rPr>
-        <w:t xml:space="preserve">for R1. R2 and RC2 show essentially no change, while RC1 increases slightly. Under Relaxed TW, none of the families </w:t>
       </w:r>
       <w:proofErr w:type="gramStart"/>
       <w:r>
@@ -29068,7 +29016,6 @@
           <w:rFonts w:ascii="Times New Roman" w:hAnsi="Times New Roman" w:cs="Times New Roman"/>
           <w:lang w:val="en-US"/>
         </w:rPr>
-        <w:t>obtains</w:t>
       </w:r>
       <w:proofErr w:type="gramEnd"/>
       <w:r>
@@ -29076,7 +29023,6 @@
           <w:rFonts w:ascii="Times New Roman" w:hAnsi="Times New Roman" w:cs="Times New Roman"/>
           <w:lang w:val="en-US"/>
         </w:rPr>
-        <w:t xml:space="preserve"> a meaningful reduction in charging </w:t>
       </w:r>
       <w:proofErr w:type="gramStart"/>
       <w:r>
@@ -29084,7 +29030,6 @@
           <w:rFonts w:ascii="Times New Roman" w:hAnsi="Times New Roman" w:cs="Times New Roman"/>
           <w:lang w:val="en-US"/>
         </w:rPr>
-        <w:t>expense</w:t>
       </w:r>
       <w:proofErr w:type="gramEnd"/>
       <w:r>
@@ -29092,7 +29037,6 @@
           <w:rFonts w:ascii="Times New Roman" w:hAnsi="Times New Roman" w:cs="Times New Roman"/>
           <w:lang w:val="en-US"/>
         </w:rPr>
-        <w:t>.</w:t>
       </w:r>
     </w:p>
     <w:p>
@@ -30231,6 +30175,4093 @@
       </w:r>
     </w:p>
     <w:p>
+      <w:r>
+        <w:rPr>
+          <w:b/>
+        </w:rPr>
+        <w:t>Table S1. Schneider EVRPTW external validation (56 instances; seeds 0–2; 30 s primary). 264/336 attempts feasible; 12 hard instances remain with one unserved customer.</w:t>
+      </w:r>
+    </w:p>
+    <w:tbl>
+      <w:tblPr>
+        <w:tblStyle w:val="Grilledutableau"/>
+        <w:tblW w:type="auto" w:w="0"/>
+        <w:tblLook w:firstColumn="1" w:firstRow="1" w:lastColumn="0" w:lastRow="0" w:noHBand="0" w:noVBand="1" w:val="04A0"/>
+      </w:tblPr>
+      <w:tblGrid>
+        <w:gridCol w:w="1512"/>
+        <w:gridCol w:w="1512"/>
+        <w:gridCol w:w="1512"/>
+        <w:gridCol w:w="1512"/>
+        <w:gridCol w:w="1512"/>
+        <w:gridCol w:w="1512"/>
+      </w:tblGrid>
+      <w:tr>
+        <w:tc>
+          <w:tcPr>
+            <w:tcW w:type="dxa" w:w="1512"/>
+          </w:tcPr>
+          <w:p>
+            <w:r>
+              <w:t>method</w:t>
+            </w:r>
+          </w:p>
+        </w:tc>
+        <w:tc>
+          <w:tcPr>
+            <w:tcW w:type="dxa" w:w="1512"/>
+          </w:tcPr>
+          <w:p>
+            <w:r>
+              <w:t>n</w:t>
+            </w:r>
+          </w:p>
+        </w:tc>
+        <w:tc>
+          <w:tcPr>
+            <w:tcW w:type="dxa" w:w="1512"/>
+          </w:tcPr>
+          <w:p>
+            <w:r>
+              <w:t>mean_k</w:t>
+            </w:r>
+          </w:p>
+        </w:tc>
+        <w:tc>
+          <w:tcPr>
+            <w:tcW w:type="dxa" w:w="1512"/>
+          </w:tcPr>
+          <w:p>
+            <w:r>
+              <w:t>mean_distance</w:t>
+            </w:r>
+          </w:p>
+        </w:tc>
+        <w:tc>
+          <w:tcPr>
+            <w:tcW w:type="dxa" w:w="1512"/>
+          </w:tcPr>
+          <w:p>
+            <w:r>
+              <w:t>mean_duration</w:t>
+            </w:r>
+          </w:p>
+        </w:tc>
+        <w:tc>
+          <w:tcPr>
+            <w:tcW w:type="dxa" w:w="1512"/>
+          </w:tcPr>
+          <w:p>
+            <w:r>
+              <w:t>mean_charging_visits</w:t>
+            </w:r>
+          </w:p>
+        </w:tc>
+      </w:tr>
+      <w:tr>
+        <w:tc>
+          <w:tcPr>
+            <w:tcW w:type="dxa" w:w="1512"/>
+          </w:tcPr>
+          <w:p>
+            <w:r>
+              <w:t>ALNS-FR</w:t>
+            </w:r>
+          </w:p>
+        </w:tc>
+        <w:tc>
+          <w:tcPr>
+            <w:tcW w:type="dxa" w:w="1512"/>
+          </w:tcPr>
+          <w:p>
+            <w:r>
+              <w:t>132</w:t>
+            </w:r>
+          </w:p>
+        </w:tc>
+        <w:tc>
+          <w:tcPr>
+            <w:tcW w:type="dxa" w:w="1512"/>
+          </w:tcPr>
+          <w:p>
+            <w:r>
+              <w:t>7.204545454545454</w:t>
+            </w:r>
+          </w:p>
+        </w:tc>
+        <w:tc>
+          <w:tcPr>
+            <w:tcW w:type="dxa" w:w="1512"/>
+          </w:tcPr>
+          <w:p>
+            <w:r>
+              <w:t>1148.6147000970263</w:t>
+            </w:r>
+          </w:p>
+        </w:tc>
+        <w:tc>
+          <w:tcPr>
+            <w:tcW w:type="dxa" w:w="1512"/>
+          </w:tcPr>
+          <w:p>
+            <w:r>
+              <w:t>6855.947948718803</w:t>
+            </w:r>
+          </w:p>
+        </w:tc>
+        <w:tc>
+          <w:tcPr>
+            <w:tcW w:type="dxa" w:w="1512"/>
+          </w:tcPr>
+          <w:p>
+            <w:r>
+              <w:t>11.787878787878787</w:t>
+            </w:r>
+          </w:p>
+        </w:tc>
+      </w:tr>
+      <w:tr>
+        <w:tc>
+          <w:tcPr>
+            <w:tcW w:type="dxa" w:w="1512"/>
+          </w:tcPr>
+          <w:p>
+            <w:r>
+              <w:t>ALNS-PR</w:t>
+            </w:r>
+          </w:p>
+        </w:tc>
+        <w:tc>
+          <w:tcPr>
+            <w:tcW w:type="dxa" w:w="1512"/>
+          </w:tcPr>
+          <w:p>
+            <w:r>
+              <w:t>132</w:t>
+            </w:r>
+          </w:p>
+        </w:tc>
+        <w:tc>
+          <w:tcPr>
+            <w:tcW w:type="dxa" w:w="1512"/>
+          </w:tcPr>
+          <w:p>
+            <w:r>
+              <w:t>7.446969696969697</w:t>
+            </w:r>
+          </w:p>
+        </w:tc>
+        <w:tc>
+          <w:tcPr>
+            <w:tcW w:type="dxa" w:w="1512"/>
+          </w:tcPr>
+          <w:p>
+            <w:r>
+              <w:t>1145.4266106856592</w:t>
+            </w:r>
+          </w:p>
+        </w:tc>
+        <w:tc>
+          <w:tcPr>
+            <w:tcW w:type="dxa" w:w="1512"/>
+          </w:tcPr>
+          <w:p>
+            <w:r>
+              <w:t>6929.522930620699</w:t>
+            </w:r>
+          </w:p>
+        </w:tc>
+        <w:tc>
+          <w:tcPr>
+            <w:tcW w:type="dxa" w:w="1512"/>
+          </w:tcPr>
+          <w:p>
+            <w:r>
+              <w:t>10.704545454545455</w:t>
+            </w:r>
+          </w:p>
+        </w:tc>
+      </w:tr>
+    </w:tbl>
+    <w:p>
+      <w:r/>
+    </w:p>
+    <w:p>
+      <w:r>
+        <w:rPr>
+          <w:b/>
+        </w:rPr>
+        <w:t>Table S2. FR/PR convergence primary288 summary (seeds 0–1; matched budgets).</w:t>
+      </w:r>
+    </w:p>
+    <w:tbl>
+      <w:tblPr>
+        <w:tblStyle w:val="Grilledutableau"/>
+        <w:tblW w:type="auto" w:w="0"/>
+        <w:tblLook w:firstColumn="1" w:firstRow="1" w:lastColumn="0" w:lastRow="0" w:noHBand="0" w:noVBand="1" w:val="04A0"/>
+      </w:tblPr>
+      <w:tblGrid>
+        <w:gridCol w:w="2268"/>
+        <w:gridCol w:w="2268"/>
+        <w:gridCol w:w="2268"/>
+        <w:gridCol w:w="2268"/>
+      </w:tblGrid>
+      <w:tr>
+        <w:tc>
+          <w:tcPr>
+            <w:tcW w:type="dxa" w:w="2268"/>
+          </w:tcPr>
+          <w:p>
+            <w:r>
+              <w:t>Method</w:t>
+            </w:r>
+          </w:p>
+        </w:tc>
+        <w:tc>
+          <w:tcPr>
+            <w:tcW w:type="dxa" w:w="2268"/>
+          </w:tcPr>
+          <w:p>
+            <w:r>
+              <w:t>Budget</w:t>
+            </w:r>
+          </w:p>
+        </w:tc>
+        <w:tc>
+          <w:tcPr>
+            <w:tcW w:type="dxa" w:w="2268"/>
+          </w:tcPr>
+          <w:p>
+            <w:r>
+              <w:t>n_feasible</w:t>
+            </w:r>
+          </w:p>
+        </w:tc>
+        <w:tc>
+          <w:tcPr>
+            <w:tcW w:type="dxa" w:w="2268"/>
+          </w:tcPr>
+          <w:p>
+            <w:r>
+              <w:t>mean_distance</w:t>
+            </w:r>
+          </w:p>
+        </w:tc>
+      </w:tr>
+      <w:tr>
+        <w:tc>
+          <w:tcPr>
+            <w:tcW w:type="dxa" w:w="2268"/>
+          </w:tcPr>
+          <w:p>
+            <w:r>
+              <w:t>ALNS-FR</w:t>
+            </w:r>
+          </w:p>
+        </w:tc>
+        <w:tc>
+          <w:tcPr>
+            <w:tcW w:type="dxa" w:w="2268"/>
+          </w:tcPr>
+          <w:p>
+            <w:r>
+              <w:t>120s</w:t>
+            </w:r>
+          </w:p>
+        </w:tc>
+        <w:tc>
+          <w:tcPr>
+            <w:tcW w:type="dxa" w:w="2268"/>
+          </w:tcPr>
+          <w:p>
+            <w:r>
+              <w:t>48</w:t>
+            </w:r>
+          </w:p>
+        </w:tc>
+        <w:tc>
+          <w:tcPr>
+            <w:tcW w:type="dxa" w:w="2268"/>
+          </w:tcPr>
+          <w:p>
+            <w:r>
+              <w:t>48462.6</w:t>
+            </w:r>
+          </w:p>
+        </w:tc>
+      </w:tr>
+      <w:tr>
+        <w:tc>
+          <w:tcPr>
+            <w:tcW w:type="dxa" w:w="2268"/>
+          </w:tcPr>
+          <w:p>
+            <w:r>
+              <w:t>ALNS-FR</w:t>
+            </w:r>
+          </w:p>
+        </w:tc>
+        <w:tc>
+          <w:tcPr>
+            <w:tcW w:type="dxa" w:w="2268"/>
+          </w:tcPr>
+          <w:p>
+            <w:r>
+              <w:t>300s</w:t>
+            </w:r>
+          </w:p>
+        </w:tc>
+        <w:tc>
+          <w:tcPr>
+            <w:tcW w:type="dxa" w:w="2268"/>
+          </w:tcPr>
+          <w:p>
+            <w:r>
+              <w:t>48</w:t>
+            </w:r>
+          </w:p>
+        </w:tc>
+        <w:tc>
+          <w:tcPr>
+            <w:tcW w:type="dxa" w:w="2268"/>
+          </w:tcPr>
+          <w:p>
+            <w:r>
+              <w:t>47020.7</w:t>
+            </w:r>
+          </w:p>
+        </w:tc>
+      </w:tr>
+      <w:tr>
+        <w:tc>
+          <w:tcPr>
+            <w:tcW w:type="dxa" w:w="2268"/>
+          </w:tcPr>
+          <w:p>
+            <w:r>
+              <w:t>ALNS-FR</w:t>
+            </w:r>
+          </w:p>
+        </w:tc>
+        <w:tc>
+          <w:tcPr>
+            <w:tcW w:type="dxa" w:w="2268"/>
+          </w:tcPr>
+          <w:p>
+            <w:r>
+              <w:t>30s</w:t>
+            </w:r>
+          </w:p>
+        </w:tc>
+        <w:tc>
+          <w:tcPr>
+            <w:tcW w:type="dxa" w:w="2268"/>
+          </w:tcPr>
+          <w:p>
+            <w:r>
+              <w:t>48</w:t>
+            </w:r>
+          </w:p>
+        </w:tc>
+        <w:tc>
+          <w:tcPr>
+            <w:tcW w:type="dxa" w:w="2268"/>
+          </w:tcPr>
+          <w:p>
+            <w:r>
+              <w:t>49031.0</w:t>
+            </w:r>
+          </w:p>
+        </w:tc>
+      </w:tr>
+      <w:tr>
+        <w:tc>
+          <w:tcPr>
+            <w:tcW w:type="dxa" w:w="2268"/>
+          </w:tcPr>
+          <w:p>
+            <w:r>
+              <w:t>ALNS-PR</w:t>
+            </w:r>
+          </w:p>
+        </w:tc>
+        <w:tc>
+          <w:tcPr>
+            <w:tcW w:type="dxa" w:w="2268"/>
+          </w:tcPr>
+          <w:p>
+            <w:r>
+              <w:t>120s</w:t>
+            </w:r>
+          </w:p>
+        </w:tc>
+        <w:tc>
+          <w:tcPr>
+            <w:tcW w:type="dxa" w:w="2268"/>
+          </w:tcPr>
+          <w:p>
+            <w:r>
+              <w:t>48</w:t>
+            </w:r>
+          </w:p>
+        </w:tc>
+        <w:tc>
+          <w:tcPr>
+            <w:tcW w:type="dxa" w:w="2268"/>
+          </w:tcPr>
+          <w:p>
+            <w:r>
+              <w:t>48559.3</w:t>
+            </w:r>
+          </w:p>
+        </w:tc>
+      </w:tr>
+      <w:tr>
+        <w:tc>
+          <w:tcPr>
+            <w:tcW w:type="dxa" w:w="2268"/>
+          </w:tcPr>
+          <w:p>
+            <w:r>
+              <w:t>ALNS-PR</w:t>
+            </w:r>
+          </w:p>
+        </w:tc>
+        <w:tc>
+          <w:tcPr>
+            <w:tcW w:type="dxa" w:w="2268"/>
+          </w:tcPr>
+          <w:p>
+            <w:r>
+              <w:t>300s</w:t>
+            </w:r>
+          </w:p>
+        </w:tc>
+        <w:tc>
+          <w:tcPr>
+            <w:tcW w:type="dxa" w:w="2268"/>
+          </w:tcPr>
+          <w:p>
+            <w:r>
+              <w:t>48</w:t>
+            </w:r>
+          </w:p>
+        </w:tc>
+        <w:tc>
+          <w:tcPr>
+            <w:tcW w:type="dxa" w:w="2268"/>
+          </w:tcPr>
+          <w:p>
+            <w:r>
+              <w:t>48294.5</w:t>
+            </w:r>
+          </w:p>
+        </w:tc>
+      </w:tr>
+      <w:tr>
+        <w:tc>
+          <w:tcPr>
+            <w:tcW w:type="dxa" w:w="2268"/>
+          </w:tcPr>
+          <w:p>
+            <w:r>
+              <w:t>ALNS-PR</w:t>
+            </w:r>
+          </w:p>
+        </w:tc>
+        <w:tc>
+          <w:tcPr>
+            <w:tcW w:type="dxa" w:w="2268"/>
+          </w:tcPr>
+          <w:p>
+            <w:r>
+              <w:t>30s</w:t>
+            </w:r>
+          </w:p>
+        </w:tc>
+        <w:tc>
+          <w:tcPr>
+            <w:tcW w:type="dxa" w:w="2268"/>
+          </w:tcPr>
+          <w:p>
+            <w:r>
+              <w:t>48</w:t>
+            </w:r>
+          </w:p>
+        </w:tc>
+        <w:tc>
+          <w:tcPr>
+            <w:tcW w:type="dxa" w:w="2268"/>
+          </w:tcPr>
+          <w:p>
+            <w:r>
+              <w:t>50864.9</w:t>
+            </w:r>
+          </w:p>
+        </w:tc>
+      </w:tr>
+    </w:tbl>
+    <w:p>
+      <w:r/>
+    </w:p>
+    <w:p>
+      <w:r>
+        <w:rPr>
+          <w:b/>
+        </w:rPr>
+        <w:t>Table S3. HCO contribution improved/unchanged/worsened counts (five seeds).</w:t>
+      </w:r>
+    </w:p>
+    <w:tbl>
+      <w:tblPr>
+        <w:tblStyle w:val="Grilledutableau"/>
+        <w:tblW w:type="auto" w:w="0"/>
+        <w:tblLook w:firstColumn="1" w:firstRow="1" w:lastColumn="0" w:lastRow="0" w:noHBand="0" w:noVBand="1" w:val="04A0"/>
+      </w:tblPr>
+      <w:tblGrid>
+        <w:gridCol w:w="1134"/>
+        <w:gridCol w:w="1134"/>
+        <w:gridCol w:w="1134"/>
+        <w:gridCol w:w="1134"/>
+        <w:gridCol w:w="1134"/>
+        <w:gridCol w:w="1134"/>
+        <w:gridCol w:w="1134"/>
+        <w:gridCol w:w="1134"/>
+      </w:tblGrid>
+      <w:tr>
+        <w:tc>
+          <w:tcPr>
+            <w:tcW w:type="dxa" w:w="1134"/>
+          </w:tcPr>
+          <w:p>
+            <w:r>
+              <w:t>baseline</w:t>
+            </w:r>
+          </w:p>
+        </w:tc>
+        <w:tc>
+          <w:tcPr>
+            <w:tcW w:type="dxa" w:w="1134"/>
+          </w:tcPr>
+          <w:p>
+            <w:r>
+              <w:t>treatment</w:t>
+            </w:r>
+          </w:p>
+        </w:tc>
+        <w:tc>
+          <w:tcPr>
+            <w:tcW w:type="dxa" w:w="1134"/>
+          </w:tcPr>
+          <w:p>
+            <w:r>
+              <w:t>metric</w:t>
+            </w:r>
+          </w:p>
+        </w:tc>
+        <w:tc>
+          <w:tcPr>
+            <w:tcW w:type="dxa" w:w="1134"/>
+          </w:tcPr>
+          <w:p>
+            <w:r>
+              <w:t>improved</w:t>
+            </w:r>
+          </w:p>
+        </w:tc>
+        <w:tc>
+          <w:tcPr>
+            <w:tcW w:type="dxa" w:w="1134"/>
+          </w:tcPr>
+          <w:p>
+            <w:r>
+              <w:t>unchanged</w:t>
+            </w:r>
+          </w:p>
+        </w:tc>
+        <w:tc>
+          <w:tcPr>
+            <w:tcW w:type="dxa" w:w="1134"/>
+          </w:tcPr>
+          <w:p>
+            <w:r>
+              <w:t>worsened</w:t>
+            </w:r>
+          </w:p>
+        </w:tc>
+        <w:tc>
+          <w:tcPr>
+            <w:tcW w:type="dxa" w:w="1134"/>
+          </w:tcPr>
+          <w:p>
+            <w:r>
+              <w:t>missing</w:t>
+            </w:r>
+          </w:p>
+        </w:tc>
+        <w:tc>
+          <w:tcPr>
+            <w:tcW w:type="dxa" w:w="1134"/>
+          </w:tcPr>
+          <w:p>
+            <w:r>
+              <w:t>n</w:t>
+            </w:r>
+          </w:p>
+        </w:tc>
+      </w:tr>
+      <w:tr>
+        <w:tc>
+          <w:tcPr>
+            <w:tcW w:type="dxa" w:w="1134"/>
+          </w:tcPr>
+          <w:p>
+            <w:r>
+              <w:t>NoHCO</w:t>
+            </w:r>
+          </w:p>
+        </w:tc>
+        <w:tc>
+          <w:tcPr>
+            <w:tcW w:type="dxa" w:w="1134"/>
+          </w:tcPr>
+          <w:p>
+            <w:r>
+              <w:t>Het</w:t>
+            </w:r>
+          </w:p>
+        </w:tc>
+        <w:tc>
+          <w:tcPr>
+            <w:tcW w:type="dxa" w:w="1134"/>
+          </w:tcPr>
+          <w:p>
+            <w:r>
+              <w:t>charged_energy</w:t>
+            </w:r>
+          </w:p>
+        </w:tc>
+        <w:tc>
+          <w:tcPr>
+            <w:tcW w:type="dxa" w:w="1134"/>
+          </w:tcPr>
+          <w:p>
+            <w:r>
+              <w:t>17</w:t>
+            </w:r>
+          </w:p>
+        </w:tc>
+        <w:tc>
+          <w:tcPr>
+            <w:tcW w:type="dxa" w:w="1134"/>
+          </w:tcPr>
+          <w:p>
+            <w:r>
+              <w:t>501</w:t>
+            </w:r>
+          </w:p>
+        </w:tc>
+        <w:tc>
+          <w:tcPr>
+            <w:tcW w:type="dxa" w:w="1134"/>
+          </w:tcPr>
+          <w:p>
+            <w:r>
+              <w:t>82</w:t>
+            </w:r>
+          </w:p>
+        </w:tc>
+        <w:tc>
+          <w:tcPr>
+            <w:tcW w:type="dxa" w:w="1134"/>
+          </w:tcPr>
+          <w:p>
+            <w:r>
+              <w:t>0</w:t>
+            </w:r>
+          </w:p>
+        </w:tc>
+        <w:tc>
+          <w:tcPr>
+            <w:tcW w:type="dxa" w:w="1134"/>
+          </w:tcPr>
+          <w:p>
+            <w:r>
+              <w:t>600</w:t>
+            </w:r>
+          </w:p>
+        </w:tc>
+      </w:tr>
+      <w:tr>
+        <w:tc>
+          <w:tcPr>
+            <w:tcW w:type="dxa" w:w="1134"/>
+          </w:tcPr>
+          <w:p>
+            <w:r>
+              <w:t>NoHCO</w:t>
+            </w:r>
+          </w:p>
+        </w:tc>
+        <w:tc>
+          <w:tcPr>
+            <w:tcW w:type="dxa" w:w="1134"/>
+          </w:tcPr>
+          <w:p>
+            <w:r>
+              <w:t>Het</w:t>
+            </w:r>
+          </w:p>
+        </w:tc>
+        <w:tc>
+          <w:tcPr>
+            <w:tcW w:type="dxa" w:w="1134"/>
+          </w:tcPr>
+          <w:p>
+            <w:r>
+              <w:t>charging_expense</w:t>
+            </w:r>
+          </w:p>
+        </w:tc>
+        <w:tc>
+          <w:tcPr>
+            <w:tcW w:type="dxa" w:w="1134"/>
+          </w:tcPr>
+          <w:p>
+            <w:r>
+              <w:t>16</w:t>
+            </w:r>
+          </w:p>
+        </w:tc>
+        <w:tc>
+          <w:tcPr>
+            <w:tcW w:type="dxa" w:w="1134"/>
+          </w:tcPr>
+          <w:p>
+            <w:r>
+              <w:t>501</w:t>
+            </w:r>
+          </w:p>
+        </w:tc>
+        <w:tc>
+          <w:tcPr>
+            <w:tcW w:type="dxa" w:w="1134"/>
+          </w:tcPr>
+          <w:p>
+            <w:r>
+              <w:t>83</w:t>
+            </w:r>
+          </w:p>
+        </w:tc>
+        <w:tc>
+          <w:tcPr>
+            <w:tcW w:type="dxa" w:w="1134"/>
+          </w:tcPr>
+          <w:p>
+            <w:r>
+              <w:t>0</w:t>
+            </w:r>
+          </w:p>
+        </w:tc>
+        <w:tc>
+          <w:tcPr>
+            <w:tcW w:type="dxa" w:w="1134"/>
+          </w:tcPr>
+          <w:p>
+            <w:r>
+              <w:t>600</w:t>
+            </w:r>
+          </w:p>
+        </w:tc>
+      </w:tr>
+      <w:tr>
+        <w:tc>
+          <w:tcPr>
+            <w:tcW w:type="dxa" w:w="1134"/>
+          </w:tcPr>
+          <w:p>
+            <w:r>
+              <w:t>NoHCO</w:t>
+            </w:r>
+          </w:p>
+        </w:tc>
+        <w:tc>
+          <w:tcPr>
+            <w:tcW w:type="dxa" w:w="1134"/>
+          </w:tcPr>
+          <w:p>
+            <w:r>
+              <w:t>Het</w:t>
+            </w:r>
+          </w:p>
+        </w:tc>
+        <w:tc>
+          <w:tcPr>
+            <w:tcW w:type="dxa" w:w="1134"/>
+          </w:tcPr>
+          <w:p>
+            <w:r>
+              <w:t>charging_visits</w:t>
+            </w:r>
+          </w:p>
+        </w:tc>
+        <w:tc>
+          <w:tcPr>
+            <w:tcW w:type="dxa" w:w="1134"/>
+          </w:tcPr>
+          <w:p>
+            <w:r>
+              <w:t>15</w:t>
+            </w:r>
+          </w:p>
+        </w:tc>
+        <w:tc>
+          <w:tcPr>
+            <w:tcW w:type="dxa" w:w="1134"/>
+          </w:tcPr>
+          <w:p>
+            <w:r>
+              <w:t>542</w:t>
+            </w:r>
+          </w:p>
+        </w:tc>
+        <w:tc>
+          <w:tcPr>
+            <w:tcW w:type="dxa" w:w="1134"/>
+          </w:tcPr>
+          <w:p>
+            <w:r>
+              <w:t>43</w:t>
+            </w:r>
+          </w:p>
+        </w:tc>
+        <w:tc>
+          <w:tcPr>
+            <w:tcW w:type="dxa" w:w="1134"/>
+          </w:tcPr>
+          <w:p>
+            <w:r>
+              <w:t>0</w:t>
+            </w:r>
+          </w:p>
+        </w:tc>
+        <w:tc>
+          <w:tcPr>
+            <w:tcW w:type="dxa" w:w="1134"/>
+          </w:tcPr>
+          <w:p>
+            <w:r>
+              <w:t>600</w:t>
+            </w:r>
+          </w:p>
+        </w:tc>
+      </w:tr>
+      <w:tr>
+        <w:tc>
+          <w:tcPr>
+            <w:tcW w:type="dxa" w:w="1134"/>
+          </w:tcPr>
+          <w:p>
+            <w:r>
+              <w:t>NoHCO</w:t>
+            </w:r>
+          </w:p>
+        </w:tc>
+        <w:tc>
+          <w:tcPr>
+            <w:tcW w:type="dxa" w:w="1134"/>
+          </w:tcPr>
+          <w:p>
+            <w:r>
+              <w:t>Het</w:t>
+            </w:r>
+          </w:p>
+        </w:tc>
+        <w:tc>
+          <w:tcPr>
+            <w:tcW w:type="dxa" w:w="1134"/>
+          </w:tcPr>
+          <w:p>
+            <w:r>
+              <w:t>distance</w:t>
+            </w:r>
+          </w:p>
+        </w:tc>
+        <w:tc>
+          <w:tcPr>
+            <w:tcW w:type="dxa" w:w="1134"/>
+          </w:tcPr>
+          <w:p>
+            <w:r>
+              <w:t>16</w:t>
+            </w:r>
+          </w:p>
+        </w:tc>
+        <w:tc>
+          <w:tcPr>
+            <w:tcW w:type="dxa" w:w="1134"/>
+          </w:tcPr>
+          <w:p>
+            <w:r>
+              <w:t>486</w:t>
+            </w:r>
+          </w:p>
+        </w:tc>
+        <w:tc>
+          <w:tcPr>
+            <w:tcW w:type="dxa" w:w="1134"/>
+          </w:tcPr>
+          <w:p>
+            <w:r>
+              <w:t>98</w:t>
+            </w:r>
+          </w:p>
+        </w:tc>
+        <w:tc>
+          <w:tcPr>
+            <w:tcW w:type="dxa" w:w="1134"/>
+          </w:tcPr>
+          <w:p>
+            <w:r>
+              <w:t>0</w:t>
+            </w:r>
+          </w:p>
+        </w:tc>
+        <w:tc>
+          <w:tcPr>
+            <w:tcW w:type="dxa" w:w="1134"/>
+          </w:tcPr>
+          <w:p>
+            <w:r>
+              <w:t>600</w:t>
+            </w:r>
+          </w:p>
+        </w:tc>
+      </w:tr>
+      <w:tr>
+        <w:tc>
+          <w:tcPr>
+            <w:tcW w:type="dxa" w:w="1134"/>
+          </w:tcPr>
+          <w:p>
+            <w:r>
+              <w:t>NoHCO</w:t>
+            </w:r>
+          </w:p>
+        </w:tc>
+        <w:tc>
+          <w:tcPr>
+            <w:tcW w:type="dxa" w:w="1134"/>
+          </w:tcPr>
+          <w:p>
+            <w:r>
+              <w:t>Het</w:t>
+            </w:r>
+          </w:p>
+        </w:tc>
+        <w:tc>
+          <w:tcPr>
+            <w:tcW w:type="dxa" w:w="1134"/>
+          </w:tcPr>
+          <w:p>
+            <w:r>
+              <w:t>duration</w:t>
+            </w:r>
+          </w:p>
+        </w:tc>
+        <w:tc>
+          <w:tcPr>
+            <w:tcW w:type="dxa" w:w="1134"/>
+          </w:tcPr>
+          <w:p>
+            <w:r>
+              <w:t>33</w:t>
+            </w:r>
+          </w:p>
+        </w:tc>
+        <w:tc>
+          <w:tcPr>
+            <w:tcW w:type="dxa" w:w="1134"/>
+          </w:tcPr>
+          <w:p>
+            <w:r>
+              <w:t>495</w:t>
+            </w:r>
+          </w:p>
+        </w:tc>
+        <w:tc>
+          <w:tcPr>
+            <w:tcW w:type="dxa" w:w="1134"/>
+          </w:tcPr>
+          <w:p>
+            <w:r>
+              <w:t>72</w:t>
+            </w:r>
+          </w:p>
+        </w:tc>
+        <w:tc>
+          <w:tcPr>
+            <w:tcW w:type="dxa" w:w="1134"/>
+          </w:tcPr>
+          <w:p>
+            <w:r>
+              <w:t>0</w:t>
+            </w:r>
+          </w:p>
+        </w:tc>
+        <w:tc>
+          <w:tcPr>
+            <w:tcW w:type="dxa" w:w="1134"/>
+          </w:tcPr>
+          <w:p>
+            <w:r>
+              <w:t>600</w:t>
+            </w:r>
+          </w:p>
+        </w:tc>
+      </w:tr>
+      <w:tr>
+        <w:tc>
+          <w:tcPr>
+            <w:tcW w:type="dxa" w:w="1134"/>
+          </w:tcPr>
+          <w:p>
+            <w:r>
+              <w:t>NoHCO</w:t>
+            </w:r>
+          </w:p>
+        </w:tc>
+        <w:tc>
+          <w:tcPr>
+            <w:tcW w:type="dxa" w:w="1134"/>
+          </w:tcPr>
+          <w:p>
+            <w:r>
+              <w:t>Het</w:t>
+            </w:r>
+          </w:p>
+        </w:tc>
+        <w:tc>
+          <w:tcPr>
+            <w:tcW w:type="dxa" w:w="1134"/>
+          </w:tcPr>
+          <w:p>
+            <w:r>
+              <w:t>k</w:t>
+            </w:r>
+          </w:p>
+        </w:tc>
+        <w:tc>
+          <w:tcPr>
+            <w:tcW w:type="dxa" w:w="1134"/>
+          </w:tcPr>
+          <w:p>
+            <w:r>
+              <w:t>0</w:t>
+            </w:r>
+          </w:p>
+        </w:tc>
+        <w:tc>
+          <w:tcPr>
+            <w:tcW w:type="dxa" w:w="1134"/>
+          </w:tcPr>
+          <w:p>
+            <w:r>
+              <w:t>600</w:t>
+            </w:r>
+          </w:p>
+        </w:tc>
+        <w:tc>
+          <w:tcPr>
+            <w:tcW w:type="dxa" w:w="1134"/>
+          </w:tcPr>
+          <w:p>
+            <w:r>
+              <w:t>0</w:t>
+            </w:r>
+          </w:p>
+        </w:tc>
+        <w:tc>
+          <w:tcPr>
+            <w:tcW w:type="dxa" w:w="1134"/>
+          </w:tcPr>
+          <w:p>
+            <w:r>
+              <w:t>0</w:t>
+            </w:r>
+          </w:p>
+        </w:tc>
+        <w:tc>
+          <w:tcPr>
+            <w:tcW w:type="dxa" w:w="1134"/>
+          </w:tcPr>
+          <w:p>
+            <w:r>
+              <w:t>600</w:t>
+            </w:r>
+          </w:p>
+        </w:tc>
+      </w:tr>
+      <w:tr>
+        <w:tc>
+          <w:tcPr>
+            <w:tcW w:type="dxa" w:w="1134"/>
+          </w:tcPr>
+          <w:p>
+            <w:r>
+              <w:t>NoHCO</w:t>
+            </w:r>
+          </w:p>
+        </w:tc>
+        <w:tc>
+          <w:tcPr>
+            <w:tcW w:type="dxa" w:w="1134"/>
+          </w:tcPr>
+          <w:p>
+            <w:r>
+              <w:t>Het</w:t>
+            </w:r>
+          </w:p>
+        </w:tc>
+        <w:tc>
+          <w:tcPr>
+            <w:tcW w:type="dxa" w:w="1134"/>
+          </w:tcPr>
+          <w:p>
+            <w:r>
+              <w:t>station_waiting</w:t>
+            </w:r>
+          </w:p>
+        </w:tc>
+        <w:tc>
+          <w:tcPr>
+            <w:tcW w:type="dxa" w:w="1134"/>
+          </w:tcPr>
+          <w:p>
+            <w:r>
+              <w:t>24</w:t>
+            </w:r>
+          </w:p>
+        </w:tc>
+        <w:tc>
+          <w:tcPr>
+            <w:tcW w:type="dxa" w:w="1134"/>
+          </w:tcPr>
+          <w:p>
+            <w:r>
+              <w:t>517</w:t>
+            </w:r>
+          </w:p>
+        </w:tc>
+        <w:tc>
+          <w:tcPr>
+            <w:tcW w:type="dxa" w:w="1134"/>
+          </w:tcPr>
+          <w:p>
+            <w:r>
+              <w:t>59</w:t>
+            </w:r>
+          </w:p>
+        </w:tc>
+        <w:tc>
+          <w:tcPr>
+            <w:tcW w:type="dxa" w:w="1134"/>
+          </w:tcPr>
+          <w:p>
+            <w:r>
+              <w:t>0</w:t>
+            </w:r>
+          </w:p>
+        </w:tc>
+        <w:tc>
+          <w:tcPr>
+            <w:tcW w:type="dxa" w:w="1134"/>
+          </w:tcPr>
+          <w:p>
+            <w:r>
+              <w:t>600</w:t>
+            </w:r>
+          </w:p>
+        </w:tc>
+      </w:tr>
+      <w:tr>
+        <w:tc>
+          <w:tcPr>
+            <w:tcW w:type="dxa" w:w="1134"/>
+          </w:tcPr>
+          <w:p>
+            <w:r>
+              <w:t>PhaseI</w:t>
+            </w:r>
+          </w:p>
+        </w:tc>
+        <w:tc>
+          <w:tcPr>
+            <w:tcW w:type="dxa" w:w="1134"/>
+          </w:tcPr>
+          <w:p>
+            <w:r>
+              <w:t>Het</w:t>
+            </w:r>
+          </w:p>
+        </w:tc>
+        <w:tc>
+          <w:tcPr>
+            <w:tcW w:type="dxa" w:w="1134"/>
+          </w:tcPr>
+          <w:p>
+            <w:r>
+              <w:t>charged_energy</w:t>
+            </w:r>
+          </w:p>
+        </w:tc>
+        <w:tc>
+          <w:tcPr>
+            <w:tcW w:type="dxa" w:w="1134"/>
+          </w:tcPr>
+          <w:p>
+            <w:r>
+              <w:t>16</w:t>
+            </w:r>
+          </w:p>
+        </w:tc>
+        <w:tc>
+          <w:tcPr>
+            <w:tcW w:type="dxa" w:w="1134"/>
+          </w:tcPr>
+          <w:p>
+            <w:r>
+              <w:t>584</w:t>
+            </w:r>
+          </w:p>
+        </w:tc>
+        <w:tc>
+          <w:tcPr>
+            <w:tcW w:type="dxa" w:w="1134"/>
+          </w:tcPr>
+          <w:p>
+            <w:r>
+              <w:t>0</w:t>
+            </w:r>
+          </w:p>
+        </w:tc>
+        <w:tc>
+          <w:tcPr>
+            <w:tcW w:type="dxa" w:w="1134"/>
+          </w:tcPr>
+          <w:p>
+            <w:r>
+              <w:t>0</w:t>
+            </w:r>
+          </w:p>
+        </w:tc>
+        <w:tc>
+          <w:tcPr>
+            <w:tcW w:type="dxa" w:w="1134"/>
+          </w:tcPr>
+          <w:p>
+            <w:r>
+              <w:t>600</w:t>
+            </w:r>
+          </w:p>
+        </w:tc>
+      </w:tr>
+      <w:tr>
+        <w:tc>
+          <w:tcPr>
+            <w:tcW w:type="dxa" w:w="1134"/>
+          </w:tcPr>
+          <w:p>
+            <w:r>
+              <w:t>PhaseI</w:t>
+            </w:r>
+          </w:p>
+        </w:tc>
+        <w:tc>
+          <w:tcPr>
+            <w:tcW w:type="dxa" w:w="1134"/>
+          </w:tcPr>
+          <w:p>
+            <w:r>
+              <w:t>Het</w:t>
+            </w:r>
+          </w:p>
+        </w:tc>
+        <w:tc>
+          <w:tcPr>
+            <w:tcW w:type="dxa" w:w="1134"/>
+          </w:tcPr>
+          <w:p>
+            <w:r>
+              <w:t>charging_expense</w:t>
+            </w:r>
+          </w:p>
+        </w:tc>
+        <w:tc>
+          <w:tcPr>
+            <w:tcW w:type="dxa" w:w="1134"/>
+          </w:tcPr>
+          <w:p>
+            <w:r>
+              <w:t>16</w:t>
+            </w:r>
+          </w:p>
+        </w:tc>
+        <w:tc>
+          <w:tcPr>
+            <w:tcW w:type="dxa" w:w="1134"/>
+          </w:tcPr>
+          <w:p>
+            <w:r>
+              <w:t>584</w:t>
+            </w:r>
+          </w:p>
+        </w:tc>
+        <w:tc>
+          <w:tcPr>
+            <w:tcW w:type="dxa" w:w="1134"/>
+          </w:tcPr>
+          <w:p>
+            <w:r>
+              <w:t>0</w:t>
+            </w:r>
+          </w:p>
+        </w:tc>
+        <w:tc>
+          <w:tcPr>
+            <w:tcW w:type="dxa" w:w="1134"/>
+          </w:tcPr>
+          <w:p>
+            <w:r>
+              <w:t>0</w:t>
+            </w:r>
+          </w:p>
+        </w:tc>
+        <w:tc>
+          <w:tcPr>
+            <w:tcW w:type="dxa" w:w="1134"/>
+          </w:tcPr>
+          <w:p>
+            <w:r>
+              <w:t>600</w:t>
+            </w:r>
+          </w:p>
+        </w:tc>
+      </w:tr>
+      <w:tr>
+        <w:tc>
+          <w:tcPr>
+            <w:tcW w:type="dxa" w:w="1134"/>
+          </w:tcPr>
+          <w:p>
+            <w:r>
+              <w:t>PhaseI</w:t>
+            </w:r>
+          </w:p>
+        </w:tc>
+        <w:tc>
+          <w:tcPr>
+            <w:tcW w:type="dxa" w:w="1134"/>
+          </w:tcPr>
+          <w:p>
+            <w:r>
+              <w:t>Het</w:t>
+            </w:r>
+          </w:p>
+        </w:tc>
+        <w:tc>
+          <w:tcPr>
+            <w:tcW w:type="dxa" w:w="1134"/>
+          </w:tcPr>
+          <w:p>
+            <w:r>
+              <w:t>charging_visits</w:t>
+            </w:r>
+          </w:p>
+        </w:tc>
+        <w:tc>
+          <w:tcPr>
+            <w:tcW w:type="dxa" w:w="1134"/>
+          </w:tcPr>
+          <w:p>
+            <w:r>
+              <w:t>14</w:t>
+            </w:r>
+          </w:p>
+        </w:tc>
+        <w:tc>
+          <w:tcPr>
+            <w:tcW w:type="dxa" w:w="1134"/>
+          </w:tcPr>
+          <w:p>
+            <w:r>
+              <w:t>586</w:t>
+            </w:r>
+          </w:p>
+        </w:tc>
+        <w:tc>
+          <w:tcPr>
+            <w:tcW w:type="dxa" w:w="1134"/>
+          </w:tcPr>
+          <w:p>
+            <w:r>
+              <w:t>0</w:t>
+            </w:r>
+          </w:p>
+        </w:tc>
+        <w:tc>
+          <w:tcPr>
+            <w:tcW w:type="dxa" w:w="1134"/>
+          </w:tcPr>
+          <w:p>
+            <w:r>
+              <w:t>0</w:t>
+            </w:r>
+          </w:p>
+        </w:tc>
+        <w:tc>
+          <w:tcPr>
+            <w:tcW w:type="dxa" w:w="1134"/>
+          </w:tcPr>
+          <w:p>
+            <w:r>
+              <w:t>600</w:t>
+            </w:r>
+          </w:p>
+        </w:tc>
+      </w:tr>
+      <w:tr>
+        <w:tc>
+          <w:tcPr>
+            <w:tcW w:type="dxa" w:w="1134"/>
+          </w:tcPr>
+          <w:p>
+            <w:r>
+              <w:t>PhaseI</w:t>
+            </w:r>
+          </w:p>
+        </w:tc>
+        <w:tc>
+          <w:tcPr>
+            <w:tcW w:type="dxa" w:w="1134"/>
+          </w:tcPr>
+          <w:p>
+            <w:r>
+              <w:t>Het</w:t>
+            </w:r>
+          </w:p>
+        </w:tc>
+        <w:tc>
+          <w:tcPr>
+            <w:tcW w:type="dxa" w:w="1134"/>
+          </w:tcPr>
+          <w:p>
+            <w:r>
+              <w:t>distance</w:t>
+            </w:r>
+          </w:p>
+        </w:tc>
+        <w:tc>
+          <w:tcPr>
+            <w:tcW w:type="dxa" w:w="1134"/>
+          </w:tcPr>
+          <w:p>
+            <w:r>
+              <w:t>16</w:t>
+            </w:r>
+          </w:p>
+        </w:tc>
+        <w:tc>
+          <w:tcPr>
+            <w:tcW w:type="dxa" w:w="1134"/>
+          </w:tcPr>
+          <w:p>
+            <w:r>
+              <w:t>584</w:t>
+            </w:r>
+          </w:p>
+        </w:tc>
+        <w:tc>
+          <w:tcPr>
+            <w:tcW w:type="dxa" w:w="1134"/>
+          </w:tcPr>
+          <w:p>
+            <w:r>
+              <w:t>0</w:t>
+            </w:r>
+          </w:p>
+        </w:tc>
+        <w:tc>
+          <w:tcPr>
+            <w:tcW w:type="dxa" w:w="1134"/>
+          </w:tcPr>
+          <w:p>
+            <w:r>
+              <w:t>0</w:t>
+            </w:r>
+          </w:p>
+        </w:tc>
+        <w:tc>
+          <w:tcPr>
+            <w:tcW w:type="dxa" w:w="1134"/>
+          </w:tcPr>
+          <w:p>
+            <w:r>
+              <w:t>600</w:t>
+            </w:r>
+          </w:p>
+        </w:tc>
+      </w:tr>
+      <w:tr>
+        <w:tc>
+          <w:tcPr>
+            <w:tcW w:type="dxa" w:w="1134"/>
+          </w:tcPr>
+          <w:p>
+            <w:r>
+              <w:t>PhaseI</w:t>
+            </w:r>
+          </w:p>
+        </w:tc>
+        <w:tc>
+          <w:tcPr>
+            <w:tcW w:type="dxa" w:w="1134"/>
+          </w:tcPr>
+          <w:p>
+            <w:r>
+              <w:t>Het</w:t>
+            </w:r>
+          </w:p>
+        </w:tc>
+        <w:tc>
+          <w:tcPr>
+            <w:tcW w:type="dxa" w:w="1134"/>
+          </w:tcPr>
+          <w:p>
+            <w:r>
+              <w:t>duration</w:t>
+            </w:r>
+          </w:p>
+        </w:tc>
+        <w:tc>
+          <w:tcPr>
+            <w:tcW w:type="dxa" w:w="1134"/>
+          </w:tcPr>
+          <w:p>
+            <w:r>
+              <w:t>8</w:t>
+            </w:r>
+          </w:p>
+        </w:tc>
+        <w:tc>
+          <w:tcPr>
+            <w:tcW w:type="dxa" w:w="1134"/>
+          </w:tcPr>
+          <w:p>
+            <w:r>
+              <w:t>584</w:t>
+            </w:r>
+          </w:p>
+        </w:tc>
+        <w:tc>
+          <w:tcPr>
+            <w:tcW w:type="dxa" w:w="1134"/>
+          </w:tcPr>
+          <w:p>
+            <w:r>
+              <w:t>8</w:t>
+            </w:r>
+          </w:p>
+        </w:tc>
+        <w:tc>
+          <w:tcPr>
+            <w:tcW w:type="dxa" w:w="1134"/>
+          </w:tcPr>
+          <w:p>
+            <w:r>
+              <w:t>0</w:t>
+            </w:r>
+          </w:p>
+        </w:tc>
+        <w:tc>
+          <w:tcPr>
+            <w:tcW w:type="dxa" w:w="1134"/>
+          </w:tcPr>
+          <w:p>
+            <w:r>
+              <w:t>600</w:t>
+            </w:r>
+          </w:p>
+        </w:tc>
+      </w:tr>
+      <w:tr>
+        <w:tc>
+          <w:tcPr>
+            <w:tcW w:type="dxa" w:w="1134"/>
+          </w:tcPr>
+          <w:p>
+            <w:r>
+              <w:t>PhaseI</w:t>
+            </w:r>
+          </w:p>
+        </w:tc>
+        <w:tc>
+          <w:tcPr>
+            <w:tcW w:type="dxa" w:w="1134"/>
+          </w:tcPr>
+          <w:p>
+            <w:r>
+              <w:t>Het</w:t>
+            </w:r>
+          </w:p>
+        </w:tc>
+        <w:tc>
+          <w:tcPr>
+            <w:tcW w:type="dxa" w:w="1134"/>
+          </w:tcPr>
+          <w:p>
+            <w:r>
+              <w:t>k</w:t>
+            </w:r>
+          </w:p>
+        </w:tc>
+        <w:tc>
+          <w:tcPr>
+            <w:tcW w:type="dxa" w:w="1134"/>
+          </w:tcPr>
+          <w:p>
+            <w:r>
+              <w:t>0</w:t>
+            </w:r>
+          </w:p>
+        </w:tc>
+        <w:tc>
+          <w:tcPr>
+            <w:tcW w:type="dxa" w:w="1134"/>
+          </w:tcPr>
+          <w:p>
+            <w:r>
+              <w:t>600</w:t>
+            </w:r>
+          </w:p>
+        </w:tc>
+        <w:tc>
+          <w:tcPr>
+            <w:tcW w:type="dxa" w:w="1134"/>
+          </w:tcPr>
+          <w:p>
+            <w:r>
+              <w:t>0</w:t>
+            </w:r>
+          </w:p>
+        </w:tc>
+        <w:tc>
+          <w:tcPr>
+            <w:tcW w:type="dxa" w:w="1134"/>
+          </w:tcPr>
+          <w:p>
+            <w:r>
+              <w:t>0</w:t>
+            </w:r>
+          </w:p>
+        </w:tc>
+        <w:tc>
+          <w:tcPr>
+            <w:tcW w:type="dxa" w:w="1134"/>
+          </w:tcPr>
+          <w:p>
+            <w:r>
+              <w:t>600</w:t>
+            </w:r>
+          </w:p>
+        </w:tc>
+      </w:tr>
+      <w:tr>
+        <w:tc>
+          <w:tcPr>
+            <w:tcW w:type="dxa" w:w="1134"/>
+          </w:tcPr>
+          <w:p>
+            <w:r>
+              <w:t>PhaseI</w:t>
+            </w:r>
+          </w:p>
+        </w:tc>
+        <w:tc>
+          <w:tcPr>
+            <w:tcW w:type="dxa" w:w="1134"/>
+          </w:tcPr>
+          <w:p>
+            <w:r>
+              <w:t>Het</w:t>
+            </w:r>
+          </w:p>
+        </w:tc>
+        <w:tc>
+          <w:tcPr>
+            <w:tcW w:type="dxa" w:w="1134"/>
+          </w:tcPr>
+          <w:p>
+            <w:r>
+              <w:t>station_waiting</w:t>
+            </w:r>
+          </w:p>
+        </w:tc>
+        <w:tc>
+          <w:tcPr>
+            <w:tcW w:type="dxa" w:w="1134"/>
+          </w:tcPr>
+          <w:p>
+            <w:r>
+              <w:t>16</w:t>
+            </w:r>
+          </w:p>
+        </w:tc>
+        <w:tc>
+          <w:tcPr>
+            <w:tcW w:type="dxa" w:w="1134"/>
+          </w:tcPr>
+          <w:p>
+            <w:r>
+              <w:t>584</w:t>
+            </w:r>
+          </w:p>
+        </w:tc>
+        <w:tc>
+          <w:tcPr>
+            <w:tcW w:type="dxa" w:w="1134"/>
+          </w:tcPr>
+          <w:p>
+            <w:r>
+              <w:t>0</w:t>
+            </w:r>
+          </w:p>
+        </w:tc>
+        <w:tc>
+          <w:tcPr>
+            <w:tcW w:type="dxa" w:w="1134"/>
+          </w:tcPr>
+          <w:p>
+            <w:r>
+              <w:t>0</w:t>
+            </w:r>
+          </w:p>
+        </w:tc>
+        <w:tc>
+          <w:tcPr>
+            <w:tcW w:type="dxa" w:w="1134"/>
+          </w:tcPr>
+          <w:p>
+            <w:r>
+              <w:t>600</w:t>
+            </w:r>
+          </w:p>
+        </w:tc>
+      </w:tr>
+      <w:tr>
+        <w:tc>
+          <w:tcPr>
+            <w:tcW w:type="dxa" w:w="1134"/>
+          </w:tcPr>
+          <w:p>
+            <w:r>
+              <w:t>PhaseI</w:t>
+            </w:r>
+          </w:p>
+        </w:tc>
+        <w:tc>
+          <w:tcPr>
+            <w:tcW w:type="dxa" w:w="1134"/>
+          </w:tcPr>
+          <w:p>
+            <w:r>
+              <w:t>NoHCO</w:t>
+            </w:r>
+          </w:p>
+        </w:tc>
+        <w:tc>
+          <w:tcPr>
+            <w:tcW w:type="dxa" w:w="1134"/>
+          </w:tcPr>
+          <w:p>
+            <w:r>
+              <w:t>charged_energy</w:t>
+            </w:r>
+          </w:p>
+        </w:tc>
+        <w:tc>
+          <w:tcPr>
+            <w:tcW w:type="dxa" w:w="1134"/>
+          </w:tcPr>
+          <w:p>
+            <w:r>
+              <w:t>90</w:t>
+            </w:r>
+          </w:p>
+        </w:tc>
+        <w:tc>
+          <w:tcPr>
+            <w:tcW w:type="dxa" w:w="1134"/>
+          </w:tcPr>
+          <w:p>
+            <w:r>
+              <w:t>509</w:t>
+            </w:r>
+          </w:p>
+        </w:tc>
+        <w:tc>
+          <w:tcPr>
+            <w:tcW w:type="dxa" w:w="1134"/>
+          </w:tcPr>
+          <w:p>
+            <w:r>
+              <w:t>1</w:t>
+            </w:r>
+          </w:p>
+        </w:tc>
+        <w:tc>
+          <w:tcPr>
+            <w:tcW w:type="dxa" w:w="1134"/>
+          </w:tcPr>
+          <w:p>
+            <w:r>
+              <w:t>0</w:t>
+            </w:r>
+          </w:p>
+        </w:tc>
+        <w:tc>
+          <w:tcPr>
+            <w:tcW w:type="dxa" w:w="1134"/>
+          </w:tcPr>
+          <w:p>
+            <w:r>
+              <w:t>600</w:t>
+            </w:r>
+          </w:p>
+        </w:tc>
+      </w:tr>
+      <w:tr>
+        <w:tc>
+          <w:tcPr>
+            <w:tcW w:type="dxa" w:w="1134"/>
+          </w:tcPr>
+          <w:p>
+            <w:r>
+              <w:t>PhaseI</w:t>
+            </w:r>
+          </w:p>
+        </w:tc>
+        <w:tc>
+          <w:tcPr>
+            <w:tcW w:type="dxa" w:w="1134"/>
+          </w:tcPr>
+          <w:p>
+            <w:r>
+              <w:t>NoHCO</w:t>
+            </w:r>
+          </w:p>
+        </w:tc>
+        <w:tc>
+          <w:tcPr>
+            <w:tcW w:type="dxa" w:w="1134"/>
+          </w:tcPr>
+          <w:p>
+            <w:r>
+              <w:t>charging_expense</w:t>
+            </w:r>
+          </w:p>
+        </w:tc>
+        <w:tc>
+          <w:tcPr>
+            <w:tcW w:type="dxa" w:w="1134"/>
+          </w:tcPr>
+          <w:p>
+            <w:r>
+              <w:t>91</w:t>
+            </w:r>
+          </w:p>
+        </w:tc>
+        <w:tc>
+          <w:tcPr>
+            <w:tcW w:type="dxa" w:w="1134"/>
+          </w:tcPr>
+          <w:p>
+            <w:r>
+              <w:t>509</w:t>
+            </w:r>
+          </w:p>
+        </w:tc>
+        <w:tc>
+          <w:tcPr>
+            <w:tcW w:type="dxa" w:w="1134"/>
+          </w:tcPr>
+          <w:p>
+            <w:r>
+              <w:t>0</w:t>
+            </w:r>
+          </w:p>
+        </w:tc>
+        <w:tc>
+          <w:tcPr>
+            <w:tcW w:type="dxa" w:w="1134"/>
+          </w:tcPr>
+          <w:p>
+            <w:r>
+              <w:t>0</w:t>
+            </w:r>
+          </w:p>
+        </w:tc>
+        <w:tc>
+          <w:tcPr>
+            <w:tcW w:type="dxa" w:w="1134"/>
+          </w:tcPr>
+          <w:p>
+            <w:r>
+              <w:t>600</w:t>
+            </w:r>
+          </w:p>
+        </w:tc>
+      </w:tr>
+      <w:tr>
+        <w:tc>
+          <w:tcPr>
+            <w:tcW w:type="dxa" w:w="1134"/>
+          </w:tcPr>
+          <w:p>
+            <w:r>
+              <w:t>PhaseI</w:t>
+            </w:r>
+          </w:p>
+        </w:tc>
+        <w:tc>
+          <w:tcPr>
+            <w:tcW w:type="dxa" w:w="1134"/>
+          </w:tcPr>
+          <w:p>
+            <w:r>
+              <w:t>NoHCO</w:t>
+            </w:r>
+          </w:p>
+        </w:tc>
+        <w:tc>
+          <w:tcPr>
+            <w:tcW w:type="dxa" w:w="1134"/>
+          </w:tcPr>
+          <w:p>
+            <w:r>
+              <w:t>charging_visits</w:t>
+            </w:r>
+          </w:p>
+        </w:tc>
+        <w:tc>
+          <w:tcPr>
+            <w:tcW w:type="dxa" w:w="1134"/>
+          </w:tcPr>
+          <w:p>
+            <w:r>
+              <w:t>46</w:t>
+            </w:r>
+          </w:p>
+        </w:tc>
+        <w:tc>
+          <w:tcPr>
+            <w:tcW w:type="dxa" w:w="1134"/>
+          </w:tcPr>
+          <w:p>
+            <w:r>
+              <w:t>551</w:t>
+            </w:r>
+          </w:p>
+        </w:tc>
+        <w:tc>
+          <w:tcPr>
+            <w:tcW w:type="dxa" w:w="1134"/>
+          </w:tcPr>
+          <w:p>
+            <w:r>
+              <w:t>3</w:t>
+            </w:r>
+          </w:p>
+        </w:tc>
+        <w:tc>
+          <w:tcPr>
+            <w:tcW w:type="dxa" w:w="1134"/>
+          </w:tcPr>
+          <w:p>
+            <w:r>
+              <w:t>0</w:t>
+            </w:r>
+          </w:p>
+        </w:tc>
+        <w:tc>
+          <w:tcPr>
+            <w:tcW w:type="dxa" w:w="1134"/>
+          </w:tcPr>
+          <w:p>
+            <w:r>
+              <w:t>600</w:t>
+            </w:r>
+          </w:p>
+        </w:tc>
+      </w:tr>
+      <w:tr>
+        <w:tc>
+          <w:tcPr>
+            <w:tcW w:type="dxa" w:w="1134"/>
+          </w:tcPr>
+          <w:p>
+            <w:r>
+              <w:t>PhaseI</w:t>
+            </w:r>
+          </w:p>
+        </w:tc>
+        <w:tc>
+          <w:tcPr>
+            <w:tcW w:type="dxa" w:w="1134"/>
+          </w:tcPr>
+          <w:p>
+            <w:r>
+              <w:t>NoHCO</w:t>
+            </w:r>
+          </w:p>
+        </w:tc>
+        <w:tc>
+          <w:tcPr>
+            <w:tcW w:type="dxa" w:w="1134"/>
+          </w:tcPr>
+          <w:p>
+            <w:r>
+              <w:t>distance</w:t>
+            </w:r>
+          </w:p>
+        </w:tc>
+        <w:tc>
+          <w:tcPr>
+            <w:tcW w:type="dxa" w:w="1134"/>
+          </w:tcPr>
+          <w:p>
+            <w:r>
+              <w:t>107</w:t>
+            </w:r>
+          </w:p>
+        </w:tc>
+        <w:tc>
+          <w:tcPr>
+            <w:tcW w:type="dxa" w:w="1134"/>
+          </w:tcPr>
+          <w:p>
+            <w:r>
+              <w:t>493</w:t>
+            </w:r>
+          </w:p>
+        </w:tc>
+        <w:tc>
+          <w:tcPr>
+            <w:tcW w:type="dxa" w:w="1134"/>
+          </w:tcPr>
+          <w:p>
+            <w:r>
+              <w:t>0</w:t>
+            </w:r>
+          </w:p>
+        </w:tc>
+        <w:tc>
+          <w:tcPr>
+            <w:tcW w:type="dxa" w:w="1134"/>
+          </w:tcPr>
+          <w:p>
+            <w:r>
+              <w:t>0</w:t>
+            </w:r>
+          </w:p>
+        </w:tc>
+        <w:tc>
+          <w:tcPr>
+            <w:tcW w:type="dxa" w:w="1134"/>
+          </w:tcPr>
+          <w:p>
+            <w:r>
+              <w:t>600</w:t>
+            </w:r>
+          </w:p>
+        </w:tc>
+      </w:tr>
+      <w:tr>
+        <w:tc>
+          <w:tcPr>
+            <w:tcW w:type="dxa" w:w="1134"/>
+          </w:tcPr>
+          <w:p>
+            <w:r>
+              <w:t>PhaseI</w:t>
+            </w:r>
+          </w:p>
+        </w:tc>
+        <w:tc>
+          <w:tcPr>
+            <w:tcW w:type="dxa" w:w="1134"/>
+          </w:tcPr>
+          <w:p>
+            <w:r>
+              <w:t>NoHCO</w:t>
+            </w:r>
+          </w:p>
+        </w:tc>
+        <w:tc>
+          <w:tcPr>
+            <w:tcW w:type="dxa" w:w="1134"/>
+          </w:tcPr>
+          <w:p>
+            <w:r>
+              <w:t>duration</w:t>
+            </w:r>
+          </w:p>
+        </w:tc>
+        <w:tc>
+          <w:tcPr>
+            <w:tcW w:type="dxa" w:w="1134"/>
+          </w:tcPr>
+          <w:p>
+            <w:r>
+              <w:t>70</w:t>
+            </w:r>
+          </w:p>
+        </w:tc>
+        <w:tc>
+          <w:tcPr>
+            <w:tcW w:type="dxa" w:w="1134"/>
+          </w:tcPr>
+          <w:p>
+            <w:r>
+              <w:t>502</w:t>
+            </w:r>
+          </w:p>
+        </w:tc>
+        <w:tc>
+          <w:tcPr>
+            <w:tcW w:type="dxa" w:w="1134"/>
+          </w:tcPr>
+          <w:p>
+            <w:r>
+              <w:t>28</w:t>
+            </w:r>
+          </w:p>
+        </w:tc>
+        <w:tc>
+          <w:tcPr>
+            <w:tcW w:type="dxa" w:w="1134"/>
+          </w:tcPr>
+          <w:p>
+            <w:r>
+              <w:t>0</w:t>
+            </w:r>
+          </w:p>
+        </w:tc>
+        <w:tc>
+          <w:tcPr>
+            <w:tcW w:type="dxa" w:w="1134"/>
+          </w:tcPr>
+          <w:p>
+            <w:r>
+              <w:t>600</w:t>
+            </w:r>
+          </w:p>
+        </w:tc>
+      </w:tr>
+      <w:tr>
+        <w:tc>
+          <w:tcPr>
+            <w:tcW w:type="dxa" w:w="1134"/>
+          </w:tcPr>
+          <w:p>
+            <w:r>
+              <w:t>PhaseI</w:t>
+            </w:r>
+          </w:p>
+        </w:tc>
+        <w:tc>
+          <w:tcPr>
+            <w:tcW w:type="dxa" w:w="1134"/>
+          </w:tcPr>
+          <w:p>
+            <w:r>
+              <w:t>NoHCO</w:t>
+            </w:r>
+          </w:p>
+        </w:tc>
+        <w:tc>
+          <w:tcPr>
+            <w:tcW w:type="dxa" w:w="1134"/>
+          </w:tcPr>
+          <w:p>
+            <w:r>
+              <w:t>k</w:t>
+            </w:r>
+          </w:p>
+        </w:tc>
+        <w:tc>
+          <w:tcPr>
+            <w:tcW w:type="dxa" w:w="1134"/>
+          </w:tcPr>
+          <w:p>
+            <w:r>
+              <w:t>0</w:t>
+            </w:r>
+          </w:p>
+        </w:tc>
+        <w:tc>
+          <w:tcPr>
+            <w:tcW w:type="dxa" w:w="1134"/>
+          </w:tcPr>
+          <w:p>
+            <w:r>
+              <w:t>600</w:t>
+            </w:r>
+          </w:p>
+        </w:tc>
+        <w:tc>
+          <w:tcPr>
+            <w:tcW w:type="dxa" w:w="1134"/>
+          </w:tcPr>
+          <w:p>
+            <w:r>
+              <w:t>0</w:t>
+            </w:r>
+          </w:p>
+        </w:tc>
+        <w:tc>
+          <w:tcPr>
+            <w:tcW w:type="dxa" w:w="1134"/>
+          </w:tcPr>
+          <w:p>
+            <w:r>
+              <w:t>0</w:t>
+            </w:r>
+          </w:p>
+        </w:tc>
+        <w:tc>
+          <w:tcPr>
+            <w:tcW w:type="dxa" w:w="1134"/>
+          </w:tcPr>
+          <w:p>
+            <w:r>
+              <w:t>600</w:t>
+            </w:r>
+          </w:p>
+        </w:tc>
+      </w:tr>
+    </w:tbl>
+    <w:p>
+      <w:r/>
+    </w:p>
+    <w:p>
+      <w:r>
+        <w:rPr>
+          <w:b/>
+        </w:rPr>
+        <w:t>Table S4. Energy accounting (propulsion vs en-route purchased vs depot replenishment).</w:t>
+      </w:r>
+    </w:p>
+    <w:tbl>
+      <w:tblPr>
+        <w:tblStyle w:val="Grilledutableau"/>
+        <w:tblW w:type="auto" w:w="0"/>
+        <w:tblLook w:firstColumn="1" w:firstRow="1" w:lastColumn="0" w:lastRow="0" w:noHBand="0" w:noVBand="1" w:val="04A0"/>
+      </w:tblPr>
+      <w:tblGrid>
+        <w:gridCol w:w="1134"/>
+        <w:gridCol w:w="1134"/>
+        <w:gridCol w:w="1134"/>
+        <w:gridCol w:w="1134"/>
+        <w:gridCol w:w="1134"/>
+        <w:gridCol w:w="1134"/>
+        <w:gridCol w:w="1134"/>
+        <w:gridCol w:w="1134"/>
+      </w:tblGrid>
+      <w:tr>
+        <w:tc>
+          <w:tcPr>
+            <w:tcW w:type="dxa" w:w="1134"/>
+          </w:tcPr>
+          <w:p>
+            <w:r>
+              <w:t>tw</w:t>
+            </w:r>
+          </w:p>
+        </w:tc>
+        <w:tc>
+          <w:tcPr>
+            <w:tcW w:type="dxa" w:w="1134"/>
+          </w:tcPr>
+          <w:p>
+            <w:r>
+              <w:t>method</w:t>
+            </w:r>
+          </w:p>
+        </w:tc>
+        <w:tc>
+          <w:tcPr>
+            <w:tcW w:type="dxa" w:w="1134"/>
+          </w:tcPr>
+          <w:p>
+            <w:r>
+              <w:t>n_instances</w:t>
+            </w:r>
+          </w:p>
+        </w:tc>
+        <w:tc>
+          <w:tcPr>
+            <w:tcW w:type="dxa" w:w="1134"/>
+          </w:tcPr>
+          <w:p>
+            <w:r>
+              <w:t>energy_note</w:t>
+            </w:r>
+          </w:p>
+        </w:tc>
+        <w:tc>
+          <w:tcPr>
+            <w:tcW w:type="dxa" w:w="1134"/>
+          </w:tcPr>
+          <w:p>
+            <w:r>
+              <w:t>mean_propulsion_energy</w:t>
+            </w:r>
+          </w:p>
+        </w:tc>
+        <w:tc>
+          <w:tcPr>
+            <w:tcW w:type="dxa" w:w="1134"/>
+          </w:tcPr>
+          <w:p>
+            <w:r>
+              <w:t>mean_enroute_purchased_energy</w:t>
+            </w:r>
+          </w:p>
+        </w:tc>
+        <w:tc>
+          <w:tcPr>
+            <w:tcW w:type="dxa" w:w="1134"/>
+          </w:tcPr>
+          <w:p>
+            <w:r>
+              <w:t>mean_depot_replenishment_energy</w:t>
+            </w:r>
+          </w:p>
+        </w:tc>
+        <w:tc>
+          <w:tcPr>
+            <w:tcW w:type="dxa" w:w="1134"/>
+          </w:tcPr>
+          <w:p>
+            <w:r>
+              <w:t>mean_residual_battery_at_depot</w:t>
+            </w:r>
+          </w:p>
+        </w:tc>
+      </w:tr>
+      <w:tr>
+        <w:tc>
+          <w:tcPr>
+            <w:tcW w:type="dxa" w:w="1134"/>
+          </w:tcPr>
+          <w:p>
+            <w:r>
+              <w:t>original</w:t>
+            </w:r>
+          </w:p>
+        </w:tc>
+        <w:tc>
+          <w:tcPr>
+            <w:tcW w:type="dxa" w:w="1134"/>
+          </w:tcPr>
+          <w:p>
+            <w:r>
+              <w:t>GI</w:t>
+            </w:r>
+          </w:p>
+        </w:tc>
+        <w:tc>
+          <w:tcPr>
+            <w:tcW w:type="dxa" w:w="1134"/>
+          </w:tcPr>
+          <w:p>
+            <w:r>
+              <w:t>60</w:t>
+            </w:r>
+          </w:p>
+        </w:tc>
+        <w:tc>
+          <w:tcPr>
+            <w:tcW w:type="dxa" w:w="1134"/>
+          </w:tcPr>
+          <w:p>
+            <w:r>
+              <w:t>depot/residual reconstructed via aggregate identity</w:t>
+            </w:r>
+          </w:p>
+        </w:tc>
+        <w:tc>
+          <w:tcPr>
+            <w:tcW w:type="dxa" w:w="1134"/>
+          </w:tcPr>
+          <w:p>
+            <w:r>
+              <w:t>59123.70945986311</w:t>
+            </w:r>
+          </w:p>
+        </w:tc>
+        <w:tc>
+          <w:tcPr>
+            <w:tcW w:type="dxa" w:w="1134"/>
+          </w:tcPr>
+          <w:p>
+            <w:r>
+              <w:t>27763.297001010178</w:t>
+            </w:r>
+          </w:p>
+        </w:tc>
+        <w:tc>
+          <w:tcPr>
+            <w:tcW w:type="dxa" w:w="1134"/>
+          </w:tcPr>
+          <w:p>
+            <w:r>
+              <w:t>31360.412458852927</w:t>
+            </w:r>
+          </w:p>
+        </w:tc>
+        <w:tc>
+          <w:tcPr>
+            <w:tcW w:type="dxa" w:w="1134"/>
+          </w:tcPr>
+          <w:p>
+            <w:r>
+              <w:t>14939.587541147073</w:t>
+            </w:r>
+          </w:p>
+        </w:tc>
+      </w:tr>
+      <w:tr>
+        <w:tc>
+          <w:tcPr>
+            <w:tcW w:type="dxa" w:w="1134"/>
+          </w:tcPr>
+          <w:p>
+            <w:r>
+              <w:t>original</w:t>
+            </w:r>
+          </w:p>
+        </w:tc>
+        <w:tc>
+          <w:tcPr>
+            <w:tcW w:type="dxa" w:w="1134"/>
+          </w:tcPr>
+          <w:p>
+            <w:r>
+              <w:t>VNS</w:t>
+            </w:r>
+          </w:p>
+        </w:tc>
+        <w:tc>
+          <w:tcPr>
+            <w:tcW w:type="dxa" w:w="1134"/>
+          </w:tcPr>
+          <w:p>
+            <w:r>
+              <w:t>60</w:t>
+            </w:r>
+          </w:p>
+        </w:tc>
+        <w:tc>
+          <w:tcPr>
+            <w:tcW w:type="dxa" w:w="1134"/>
+          </w:tcPr>
+          <w:p>
+            <w:r>
+              <w:t>depot/residual reconstructed via aggregate identity</w:t>
+            </w:r>
+          </w:p>
+        </w:tc>
+        <w:tc>
+          <w:tcPr>
+            <w:tcW w:type="dxa" w:w="1134"/>
+          </w:tcPr>
+          <w:p>
+            <w:r>
+              <w:t>48813.309339225685</w:t>
+            </w:r>
+          </w:p>
+        </w:tc>
+        <w:tc>
+          <w:tcPr>
+            <w:tcW w:type="dxa" w:w="1134"/>
+          </w:tcPr>
+          <w:p>
+            <w:r>
+              <w:t>22417.88957611362</w:t>
+            </w:r>
+          </w:p>
+        </w:tc>
+        <w:tc>
+          <w:tcPr>
+            <w:tcW w:type="dxa" w:w="1134"/>
+          </w:tcPr>
+          <w:p>
+            <w:r>
+              <w:t>26395.41976311207</w:t>
+            </w:r>
+          </w:p>
+        </w:tc>
+        <w:tc>
+          <w:tcPr>
+            <w:tcW w:type="dxa" w:w="1134"/>
+          </w:tcPr>
+          <w:p>
+            <w:r>
+              <w:t>18940.58023688793</w:t>
+            </w:r>
+          </w:p>
+        </w:tc>
+      </w:tr>
+      <w:tr>
+        <w:tc>
+          <w:tcPr>
+            <w:tcW w:type="dxa" w:w="1134"/>
+          </w:tcPr>
+          <w:p>
+            <w:r>
+              <w:t>original</w:t>
+            </w:r>
+          </w:p>
+        </w:tc>
+        <w:tc>
+          <w:tcPr>
+            <w:tcW w:type="dxa" w:w="1134"/>
+          </w:tcPr>
+          <w:p>
+            <w:r>
+              <w:t>SA</w:t>
+            </w:r>
+          </w:p>
+        </w:tc>
+        <w:tc>
+          <w:tcPr>
+            <w:tcW w:type="dxa" w:w="1134"/>
+          </w:tcPr>
+          <w:p>
+            <w:r>
+              <w:t>60</w:t>
+            </w:r>
+          </w:p>
+        </w:tc>
+        <w:tc>
+          <w:tcPr>
+            <w:tcW w:type="dxa" w:w="1134"/>
+          </w:tcPr>
+          <w:p>
+            <w:r>
+              <w:t>depot/residual reconstructed via aggregate identity</w:t>
+            </w:r>
+          </w:p>
+        </w:tc>
+        <w:tc>
+          <w:tcPr>
+            <w:tcW w:type="dxa" w:w="1134"/>
+          </w:tcPr>
+          <w:p>
+            <w:r>
+              <w:t>49344.51696174502</w:t>
+            </w:r>
+          </w:p>
+        </w:tc>
+        <w:tc>
+          <w:tcPr>
+            <w:tcW w:type="dxa" w:w="1134"/>
+          </w:tcPr>
+          <w:p>
+            <w:r>
+              <w:t>23625.21678796689</w:t>
+            </w:r>
+          </w:p>
+        </w:tc>
+        <w:tc>
+          <w:tcPr>
+            <w:tcW w:type="dxa" w:w="1134"/>
+          </w:tcPr>
+          <w:p>
+            <w:r>
+              <w:t>25719.300173778138</w:t>
+            </w:r>
+          </w:p>
+        </w:tc>
+        <w:tc>
+          <w:tcPr>
+            <w:tcW w:type="dxa" w:w="1134"/>
+          </w:tcPr>
+          <w:p>
+            <w:r>
+              <w:t>19800.699826221862</w:t>
+            </w:r>
+          </w:p>
+        </w:tc>
+      </w:tr>
+      <w:tr>
+        <w:tc>
+          <w:tcPr>
+            <w:tcW w:type="dxa" w:w="1134"/>
+          </w:tcPr>
+          <w:p>
+            <w:r>
+              <w:t>original</w:t>
+            </w:r>
+          </w:p>
+        </w:tc>
+        <w:tc>
+          <w:tcPr>
+            <w:tcW w:type="dxa" w:w="1134"/>
+          </w:tcPr>
+          <w:p>
+            <w:r>
+              <w:t>ALNS-FR</w:t>
+            </w:r>
+          </w:p>
+        </w:tc>
+        <w:tc>
+          <w:tcPr>
+            <w:tcW w:type="dxa" w:w="1134"/>
+          </w:tcPr>
+          <w:p>
+            <w:r>
+              <w:t>60</w:t>
+            </w:r>
+          </w:p>
+        </w:tc>
+        <w:tc>
+          <w:tcPr>
+            <w:tcW w:type="dxa" w:w="1134"/>
+          </w:tcPr>
+          <w:p>
+            <w:r>
+              <w:t>depot/residual reconstructed via aggregate identity</w:t>
+            </w:r>
+          </w:p>
+        </w:tc>
+        <w:tc>
+          <w:tcPr>
+            <w:tcW w:type="dxa" w:w="1134"/>
+          </w:tcPr>
+          <w:p>
+            <w:r>
+              <w:t>47363.00625854611</w:t>
+            </w:r>
+          </w:p>
+        </w:tc>
+        <w:tc>
+          <w:tcPr>
+            <w:tcW w:type="dxa" w:w="1134"/>
+          </w:tcPr>
+          <w:p>
+            <w:r>
+              <w:t>23294.615064157246</w:t>
+            </w:r>
+          </w:p>
+        </w:tc>
+        <w:tc>
+          <w:tcPr>
+            <w:tcW w:type="dxa" w:w="1134"/>
+          </w:tcPr>
+          <w:p>
+            <w:r>
+              <w:t>24068.391194388867</w:t>
+            </w:r>
+          </w:p>
+        </w:tc>
+        <w:tc>
+          <w:tcPr>
+            <w:tcW w:type="dxa" w:w="1134"/>
+          </w:tcPr>
+          <w:p>
+            <w:r>
+              <w:t>17905.608805611133</w:t>
+            </w:r>
+          </w:p>
+        </w:tc>
+      </w:tr>
+      <w:tr>
+        <w:tc>
+          <w:tcPr>
+            <w:tcW w:type="dxa" w:w="1134"/>
+          </w:tcPr>
+          <w:p>
+            <w:r>
+              <w:t>original</w:t>
+            </w:r>
+          </w:p>
+        </w:tc>
+        <w:tc>
+          <w:tcPr>
+            <w:tcW w:type="dxa" w:w="1134"/>
+          </w:tcPr>
+          <w:p>
+            <w:r>
+              <w:t>ALNS-PR</w:t>
+            </w:r>
+          </w:p>
+        </w:tc>
+        <w:tc>
+          <w:tcPr>
+            <w:tcW w:type="dxa" w:w="1134"/>
+          </w:tcPr>
+          <w:p>
+            <w:r>
+              <w:t>60</w:t>
+            </w:r>
+          </w:p>
+        </w:tc>
+        <w:tc>
+          <w:tcPr>
+            <w:tcW w:type="dxa" w:w="1134"/>
+          </w:tcPr>
+          <w:p>
+            <w:r>
+              <w:t>depot/residual reconstructed via aggregate identity</w:t>
+            </w:r>
+          </w:p>
+        </w:tc>
+        <w:tc>
+          <w:tcPr>
+            <w:tcW w:type="dxa" w:w="1134"/>
+          </w:tcPr>
+          <w:p>
+            <w:r>
+              <w:t>48766.90193156998</w:t>
+            </w:r>
+          </w:p>
+        </w:tc>
+        <w:tc>
+          <w:tcPr>
+            <w:tcW w:type="dxa" w:w="1134"/>
+          </w:tcPr>
+          <w:p>
+            <w:r>
+              <w:t>18898.498484897846</w:t>
+            </w:r>
+          </w:p>
+        </w:tc>
+        <w:tc>
+          <w:tcPr>
+            <w:tcW w:type="dxa" w:w="1134"/>
+          </w:tcPr>
+          <w:p>
+            <w:r>
+              <w:t>29868.403446672128</w:t>
+            </w:r>
+          </w:p>
+        </w:tc>
+        <w:tc>
+          <w:tcPr>
+            <w:tcW w:type="dxa" w:w="1134"/>
+          </w:tcPr>
+          <w:p>
+            <w:r>
+              <w:t>12171.596553327874</w:t>
+            </w:r>
+          </w:p>
+        </w:tc>
+      </w:tr>
+      <w:tr>
+        <w:tc>
+          <w:tcPr>
+            <w:tcW w:type="dxa" w:w="1134"/>
+          </w:tcPr>
+          <w:p>
+            <w:r>
+              <w:t>original</w:t>
+            </w:r>
+          </w:p>
+        </w:tc>
+        <w:tc>
+          <w:tcPr>
+            <w:tcW w:type="dxa" w:w="1134"/>
+          </w:tcPr>
+          <w:p>
+            <w:r>
+              <w:t>PhaseI-PR-15</w:t>
+            </w:r>
+          </w:p>
+        </w:tc>
+        <w:tc>
+          <w:tcPr>
+            <w:tcW w:type="dxa" w:w="1134"/>
+          </w:tcPr>
+          <w:p>
+            <w:r>
+              <w:t>60</w:t>
+            </w:r>
+          </w:p>
+        </w:tc>
+        <w:tc>
+          <w:tcPr>
+            <w:tcW w:type="dxa" w:w="1134"/>
+          </w:tcPr>
+          <w:p>
+            <w:r>
+              <w:t>depot/residual reconstructed via aggregate identity</w:t>
+            </w:r>
+          </w:p>
+        </w:tc>
+        <w:tc>
+          <w:tcPr>
+            <w:tcW w:type="dxa" w:w="1134"/>
+          </w:tcPr>
+          <w:p>
+            <w:r>
+              <w:t>50274.51500599146</w:t>
+            </w:r>
+          </w:p>
+        </w:tc>
+        <w:tc>
+          <w:tcPr>
+            <w:tcW w:type="dxa" w:w="1134"/>
+          </w:tcPr>
+          <w:p>
+            <w:r>
+              <w:t>19742.065321376947</w:t>
+            </w:r>
+          </w:p>
+        </w:tc>
+        <w:tc>
+          <w:tcPr>
+            <w:tcW w:type="dxa" w:w="1134"/>
+          </w:tcPr>
+          <w:p>
+            <w:r>
+              <w:t>30532.449684614512</w:t>
+            </w:r>
+          </w:p>
+        </w:tc>
+        <w:tc>
+          <w:tcPr>
+            <w:tcW w:type="dxa" w:w="1134"/>
+          </w:tcPr>
+          <w:p>
+            <w:r>
+              <w:t>12123.550315385486</w:t>
+            </w:r>
+          </w:p>
+        </w:tc>
+      </w:tr>
+      <w:tr>
+        <w:tc>
+          <w:tcPr>
+            <w:tcW w:type="dxa" w:w="1134"/>
+          </w:tcPr>
+          <w:p>
+            <w:r>
+              <w:t>original</w:t>
+            </w:r>
+          </w:p>
+        </w:tc>
+        <w:tc>
+          <w:tcPr>
+            <w:tcW w:type="dxa" w:w="1134"/>
+          </w:tcPr>
+          <w:p>
+            <w:r>
+              <w:t>FixedRoute-HCO-Detour</w:t>
+            </w:r>
+          </w:p>
+        </w:tc>
+        <w:tc>
+          <w:tcPr>
+            <w:tcW w:type="dxa" w:w="1134"/>
+          </w:tcPr>
+          <w:p>
+            <w:r>
+              <w:t>60</w:t>
+            </w:r>
+          </w:p>
+        </w:tc>
+        <w:tc>
+          <w:tcPr>
+            <w:tcW w:type="dxa" w:w="1134"/>
+          </w:tcPr>
+          <w:p>
+            <w:r>
+              <w:t>depot/residual reconstructed via aggregate identity</w:t>
+            </w:r>
+          </w:p>
+        </w:tc>
+        <w:tc>
+          <w:tcPr>
+            <w:tcW w:type="dxa" w:w="1134"/>
+          </w:tcPr>
+          <w:p>
+            <w:r>
+              <w:t>50246.91042315682</w:t>
+            </w:r>
+          </w:p>
+        </w:tc>
+        <w:tc>
+          <w:tcPr>
+            <w:tcW w:type="dxa" w:w="1134"/>
+          </w:tcPr>
+          <w:p>
+            <w:r>
+              <w:t>19608.8581694305</w:t>
+            </w:r>
+          </w:p>
+        </w:tc>
+        <w:tc>
+          <w:tcPr>
+            <w:tcW w:type="dxa" w:w="1134"/>
+          </w:tcPr>
+          <w:p>
+            <w:r>
+              <w:t>30638.05225372632</w:t>
+            </w:r>
+          </w:p>
+        </w:tc>
+        <w:tc>
+          <w:tcPr>
+            <w:tcW w:type="dxa" w:w="1134"/>
+          </w:tcPr>
+          <w:p>
+            <w:r>
+              <w:t>12017.947746273681</w:t>
+            </w:r>
+          </w:p>
+        </w:tc>
+      </w:tr>
+      <w:tr>
+        <w:tc>
+          <w:tcPr>
+            <w:tcW w:type="dxa" w:w="1134"/>
+          </w:tcPr>
+          <w:p>
+            <w:r>
+              <w:t>original</w:t>
+            </w:r>
+          </w:p>
+        </w:tc>
+        <w:tc>
+          <w:tcPr>
+            <w:tcW w:type="dxa" w:w="1134"/>
+          </w:tcPr>
+          <w:p>
+            <w:r>
+              <w:t>FixedRoute-HCO-Heterogeneous</w:t>
+            </w:r>
+          </w:p>
+        </w:tc>
+        <w:tc>
+          <w:tcPr>
+            <w:tcW w:type="dxa" w:w="1134"/>
+          </w:tcPr>
+          <w:p>
+            <w:r>
+              <w:t>60</w:t>
+            </w:r>
+          </w:p>
+        </w:tc>
+        <w:tc>
+          <w:tcPr>
+            <w:tcW w:type="dxa" w:w="1134"/>
+          </w:tcPr>
+          <w:p>
+            <w:r>
+              <w:t>depot/residual reconstructed via aggregate identity</w:t>
+            </w:r>
+          </w:p>
+        </w:tc>
+        <w:tc>
+          <w:tcPr>
+            <w:tcW w:type="dxa" w:w="1134"/>
+          </w:tcPr>
+          <w:p>
+            <w:r>
+              <w:t>50251.041248540874</w:t>
+            </w:r>
+          </w:p>
+        </w:tc>
+        <w:tc>
+          <w:tcPr>
+            <w:tcW w:type="dxa" w:w="1134"/>
+          </w:tcPr>
+          <w:p>
+            <w:r>
+              <w:t>19613.020528175075</w:t>
+            </w:r>
+          </w:p>
+        </w:tc>
+        <w:tc>
+          <w:tcPr>
+            <w:tcW w:type="dxa" w:w="1134"/>
+          </w:tcPr>
+          <w:p>
+            <w:r>
+              <w:t>30638.0207203658</w:t>
+            </w:r>
+          </w:p>
+        </w:tc>
+        <w:tc>
+          <w:tcPr>
+            <w:tcW w:type="dxa" w:w="1134"/>
+          </w:tcPr>
+          <w:p>
+            <w:r>
+              <w:t>12017.979279634199</w:t>
+            </w:r>
+          </w:p>
+        </w:tc>
+      </w:tr>
+      <w:tr>
+        <w:tc>
+          <w:tcPr>
+            <w:tcW w:type="dxa" w:w="1134"/>
+          </w:tcPr>
+          <w:p>
+            <w:r>
+              <w:t>original</w:t>
+            </w:r>
+          </w:p>
+        </w:tc>
+        <w:tc>
+          <w:tcPr>
+            <w:tcW w:type="dxa" w:w="1134"/>
+          </w:tcPr>
+          <w:p>
+            <w:r>
+              <w:t>PhaseII-NoHCO</w:t>
+            </w:r>
+          </w:p>
+        </w:tc>
+        <w:tc>
+          <w:tcPr>
+            <w:tcW w:type="dxa" w:w="1134"/>
+          </w:tcPr>
+          <w:p>
+            <w:r>
+              <w:t>60</w:t>
+            </w:r>
+          </w:p>
+        </w:tc>
+        <w:tc>
+          <w:tcPr>
+            <w:tcW w:type="dxa" w:w="1134"/>
+          </w:tcPr>
+          <w:p>
+            <w:r>
+              <w:t>depot/residual reconstructed via aggregate identity</w:t>
+            </w:r>
+          </w:p>
+        </w:tc>
+        <w:tc>
+          <w:tcPr>
+            <w:tcW w:type="dxa" w:w="1134"/>
+          </w:tcPr>
+          <w:p>
+            <w:r>
+              <w:t>50260.61086153865</w:t>
+            </w:r>
+          </w:p>
+        </w:tc>
+        <w:tc>
+          <w:tcPr>
+            <w:tcW w:type="dxa" w:w="1134"/>
+          </w:tcPr>
+          <w:p>
+            <w:r>
+              <w:t>19681.192339219044</w:t>
+            </w:r>
+          </w:p>
+        </w:tc>
+        <w:tc>
+          <w:tcPr>
+            <w:tcW w:type="dxa" w:w="1134"/>
+          </w:tcPr>
+          <w:p>
+            <w:r>
+              <w:t>30579.4185223196</w:t>
+            </w:r>
+          </w:p>
+        </w:tc>
+        <w:tc>
+          <w:tcPr>
+            <w:tcW w:type="dxa" w:w="1134"/>
+          </w:tcPr>
+          <w:p>
+            <w:r>
+              <w:t>12076.581477680396</w:t>
+            </w:r>
+          </w:p>
+        </w:tc>
+      </w:tr>
+      <w:tr>
+        <w:tc>
+          <w:tcPr>
+            <w:tcW w:type="dxa" w:w="1134"/>
+          </w:tcPr>
+          <w:p>
+            <w:r>
+              <w:t>original</w:t>
+            </w:r>
+          </w:p>
+        </w:tc>
+        <w:tc>
+          <w:tcPr>
+            <w:tcW w:type="dxa" w:w="1134"/>
+          </w:tcPr>
+          <w:p>
+            <w:r>
+              <w:t>PhaseII-Plain</w:t>
+            </w:r>
+          </w:p>
+        </w:tc>
+        <w:tc>
+          <w:tcPr>
+            <w:tcW w:type="dxa" w:w="1134"/>
+          </w:tcPr>
+          <w:p>
+            <w:r>
+              <w:t>60</w:t>
+            </w:r>
+          </w:p>
+        </w:tc>
+        <w:tc>
+          <w:tcPr>
+            <w:tcW w:type="dxa" w:w="1134"/>
+          </w:tcPr>
+          <w:p>
+            <w:r>
+              <w:t>depot/residual reconstructed via aggregate identity</w:t>
+            </w:r>
+          </w:p>
+        </w:tc>
+        <w:tc>
+          <w:tcPr>
+            <w:tcW w:type="dxa" w:w="1134"/>
+          </w:tcPr>
+          <w:p>
+            <w:r>
+              <w:t>49573.35746722261</w:t>
+            </w:r>
+          </w:p>
+        </w:tc>
+        <w:tc>
+          <w:tcPr>
+            <w:tcW w:type="dxa" w:w="1134"/>
+          </w:tcPr>
+          <w:p>
+            <w:r>
+              <w:t>18656.516750894207</w:t>
+            </w:r>
+          </w:p>
+        </w:tc>
+        <w:tc>
+          <w:tcPr>
+            <w:tcW w:type="dxa" w:w="1134"/>
+          </w:tcPr>
+          <w:p>
+            <w:r>
+              <w:t>30916.840716328403</w:t>
+            </w:r>
+          </w:p>
+        </w:tc>
+        <w:tc>
+          <w:tcPr>
+            <w:tcW w:type="dxa" w:w="1134"/>
+          </w:tcPr>
+          <w:p>
+            <w:r>
+              <w:t>11739.159283671597</w:t>
+            </w:r>
+          </w:p>
+        </w:tc>
+      </w:tr>
+      <w:tr>
+        <w:tc>
+          <w:tcPr>
+            <w:tcW w:type="dxa" w:w="1134"/>
+          </w:tcPr>
+          <w:p>
+            <w:r>
+              <w:t>original</w:t>
+            </w:r>
+          </w:p>
+        </w:tc>
+        <w:tc>
+          <w:tcPr>
+            <w:tcW w:type="dxa" w:w="1134"/>
+          </w:tcPr>
+          <w:p>
+            <w:r>
+              <w:t>PhaseII-Detour</w:t>
+            </w:r>
+          </w:p>
+        </w:tc>
+        <w:tc>
+          <w:tcPr>
+            <w:tcW w:type="dxa" w:w="1134"/>
+          </w:tcPr>
+          <w:p>
+            <w:r>
+              <w:t>60</w:t>
+            </w:r>
+          </w:p>
+        </w:tc>
+        <w:tc>
+          <w:tcPr>
+            <w:tcW w:type="dxa" w:w="1134"/>
+          </w:tcPr>
+          <w:p>
+            <w:r>
+              <w:t>depot/residual reconstructed via aggregate identity</w:t>
+            </w:r>
+          </w:p>
+        </w:tc>
+        <w:tc>
+          <w:tcPr>
+            <w:tcW w:type="dxa" w:w="1134"/>
+          </w:tcPr>
+          <w:p>
+            <w:r>
+              <w:t>50253.6558960553</w:t>
+            </w:r>
+          </w:p>
+        </w:tc>
+        <w:tc>
+          <w:tcPr>
+            <w:tcW w:type="dxa" w:w="1134"/>
+          </w:tcPr>
+          <w:p>
+            <w:r>
+              <w:t>19580.76994796425</w:t>
+            </w:r>
+          </w:p>
+        </w:tc>
+        <w:tc>
+          <w:tcPr>
+            <w:tcW w:type="dxa" w:w="1134"/>
+          </w:tcPr>
+          <w:p>
+            <w:r>
+              <w:t>30672.88594809105</w:t>
+            </w:r>
+          </w:p>
+        </w:tc>
+        <w:tc>
+          <w:tcPr>
+            <w:tcW w:type="dxa" w:w="1134"/>
+          </w:tcPr>
+          <w:p>
+            <w:r>
+              <w:t>11983.11405190895</w:t>
+            </w:r>
+          </w:p>
+        </w:tc>
+      </w:tr>
+      <w:tr>
+        <w:tc>
+          <w:tcPr>
+            <w:tcW w:type="dxa" w:w="1134"/>
+          </w:tcPr>
+          <w:p>
+            <w:r>
+              <w:t>original</w:t>
+            </w:r>
+          </w:p>
+        </w:tc>
+        <w:tc>
+          <w:tcPr>
+            <w:tcW w:type="dxa" w:w="1134"/>
+          </w:tcPr>
+          <w:p>
+            <w:r>
+              <w:t>PhaseII-Heterogeneous</w:t>
+            </w:r>
+          </w:p>
+        </w:tc>
+        <w:tc>
+          <w:tcPr>
+            <w:tcW w:type="dxa" w:w="1134"/>
+          </w:tcPr>
+          <w:p>
+            <w:r>
+              <w:t>60</w:t>
+            </w:r>
+          </w:p>
+        </w:tc>
+        <w:tc>
+          <w:tcPr>
+            <w:tcW w:type="dxa" w:w="1134"/>
+          </w:tcPr>
+          <w:p>
+            <w:r>
+              <w:t>depot/residual reconstructed via aggregate identity</w:t>
+            </w:r>
+          </w:p>
+        </w:tc>
+        <w:tc>
+          <w:tcPr>
+            <w:tcW w:type="dxa" w:w="1134"/>
+          </w:tcPr>
+          <w:p>
+            <w:r>
+              <w:t>50256.344839791855</w:t>
+            </w:r>
+          </w:p>
+        </w:tc>
+        <w:tc>
+          <w:tcPr>
+            <w:tcW w:type="dxa" w:w="1134"/>
+          </w:tcPr>
+          <w:p>
+            <w:r>
+              <w:t>19585.114514896555</w:t>
+            </w:r>
+          </w:p>
+        </w:tc>
+        <w:tc>
+          <w:tcPr>
+            <w:tcW w:type="dxa" w:w="1134"/>
+          </w:tcPr>
+          <w:p>
+            <w:r>
+              <w:t>30671.2303248953</w:t>
+            </w:r>
+          </w:p>
+        </w:tc>
+        <w:tc>
+          <w:tcPr>
+            <w:tcW w:type="dxa" w:w="1134"/>
+          </w:tcPr>
+          <w:p>
+            <w:r>
+              <w:t>11984.769675104702</w:t>
+            </w:r>
+          </w:p>
+        </w:tc>
+      </w:tr>
+    </w:tbl>
+    <w:p>
+      <w:r/>
+    </w:p>
+    <w:p>
+      <w:r>
+        <w:rPr>
+          <w:b/>
+        </w:rPr>
+        <w:t>Table S5. Controlled same-route full vs partial recharge (both-feasible instance means; seed-0/1 Phase-I archives). Visit sequences fixed; 198/240 cases are counterfactual full-recharge infeasible. Separate from full-solver ALNS-FR/PR.</w:t>
+      </w:r>
+    </w:p>
+    <w:tbl>
+      <w:tblPr>
+        <w:tblStyle w:val="Grilledutableau"/>
+        <w:tblW w:type="auto" w:w="0"/>
+        <w:tblLook w:firstColumn="1" w:firstRow="1" w:lastColumn="0" w:lastRow="0" w:noHBand="0" w:noVBand="1" w:val="04A0"/>
+      </w:tblPr>
+      <w:tblGrid>
+        <w:gridCol w:w="1512"/>
+        <w:gridCol w:w="1512"/>
+        <w:gridCol w:w="1512"/>
+        <w:gridCol w:w="1512"/>
+        <w:gridCol w:w="1512"/>
+        <w:gridCol w:w="1512"/>
+      </w:tblGrid>
+      <w:tr>
+        <w:tc>
+          <w:tcPr>
+            <w:tcW w:type="dxa" w:w="1512"/>
+          </w:tcPr>
+          <w:p>
+            <w:r>
+              <w:t>tw</w:t>
+            </w:r>
+          </w:p>
+        </w:tc>
+        <w:tc>
+          <w:tcPr>
+            <w:tcW w:type="dxa" w:w="1512"/>
+          </w:tcPr>
+          <w:p>
+            <w:r>
+              <w:t>metric</w:t>
+            </w:r>
+          </w:p>
+        </w:tc>
+        <w:tc>
+          <w:tcPr>
+            <w:tcW w:type="dxa" w:w="1512"/>
+          </w:tcPr>
+          <w:p>
+            <w:r>
+              <w:t>n_instances</w:t>
+            </w:r>
+          </w:p>
+        </w:tc>
+        <w:tc>
+          <w:tcPr>
+            <w:tcW w:type="dxa" w:w="1512"/>
+          </w:tcPr>
+          <w:p>
+            <w:r>
+              <w:t>mean_diff_full_minus_partial</w:t>
+            </w:r>
+          </w:p>
+        </w:tc>
+        <w:tc>
+          <w:tcPr>
+            <w:tcW w:type="dxa" w:w="1512"/>
+          </w:tcPr>
+          <w:p>
+            <w:r>
+              <w:t>ci95_lo</w:t>
+            </w:r>
+          </w:p>
+        </w:tc>
+        <w:tc>
+          <w:tcPr>
+            <w:tcW w:type="dxa" w:w="1512"/>
+          </w:tcPr>
+          <w:p>
+            <w:r>
+              <w:t>ci95_hi</w:t>
+            </w:r>
+          </w:p>
+        </w:tc>
+      </w:tr>
+      <w:tr>
+        <w:tc>
+          <w:tcPr>
+            <w:tcW w:type="dxa" w:w="1512"/>
+          </w:tcPr>
+          <w:p>
+            <w:r>
+              <w:t>original</w:t>
+            </w:r>
+          </w:p>
+        </w:tc>
+        <w:tc>
+          <w:tcPr>
+            <w:tcW w:type="dxa" w:w="1512"/>
+          </w:tcPr>
+          <w:p>
+            <w:r>
+              <w:t>charged_energy</w:t>
+            </w:r>
+          </w:p>
+        </w:tc>
+        <w:tc>
+          <w:tcPr>
+            <w:tcW w:type="dxa" w:w="1512"/>
+          </w:tcPr>
+          <w:p>
+            <w:r>
+              <w:t>12</w:t>
+            </w:r>
+          </w:p>
+        </w:tc>
+        <w:tc>
+          <w:tcPr>
+            <w:tcW w:type="dxa" w:w="1512"/>
+          </w:tcPr>
+          <w:p>
+            <w:r>
+              <w:t>459.6043182959159</w:t>
+            </w:r>
+          </w:p>
+        </w:tc>
+        <w:tc>
+          <w:tcPr>
+            <w:tcW w:type="dxa" w:w="1512"/>
+          </w:tcPr>
+          <w:p>
+            <w:r>
+              <w:t>48.98873137434324</w:t>
+            </w:r>
+          </w:p>
+        </w:tc>
+        <w:tc>
+          <w:tcPr>
+            <w:tcW w:type="dxa" w:w="1512"/>
+          </w:tcPr>
+          <w:p>
+            <w:r>
+              <w:t>1105.506328895688</w:t>
+            </w:r>
+          </w:p>
+        </w:tc>
+      </w:tr>
+      <w:tr>
+        <w:tc>
+          <w:tcPr>
+            <w:tcW w:type="dxa" w:w="1512"/>
+          </w:tcPr>
+          <w:p>
+            <w:r>
+              <w:t>original</w:t>
+            </w:r>
+          </w:p>
+        </w:tc>
+        <w:tc>
+          <w:tcPr>
+            <w:tcW w:type="dxa" w:w="1512"/>
+          </w:tcPr>
+          <w:p>
+            <w:r>
+              <w:t>charging_expense</w:t>
+            </w:r>
+          </w:p>
+        </w:tc>
+        <w:tc>
+          <w:tcPr>
+            <w:tcW w:type="dxa" w:w="1512"/>
+          </w:tcPr>
+          <w:p>
+            <w:r>
+              <w:t>12</w:t>
+            </w:r>
+          </w:p>
+        </w:tc>
+        <w:tc>
+          <w:tcPr>
+            <w:tcW w:type="dxa" w:w="1512"/>
+          </w:tcPr>
+          <w:p>
+            <w:r>
+              <w:t>261.0957925363379</w:t>
+            </w:r>
+          </w:p>
+        </w:tc>
+        <w:tc>
+          <w:tcPr>
+            <w:tcW w:type="dxa" w:w="1512"/>
+          </w:tcPr>
+          <w:p>
+            <w:r>
+              <w:t>19.20901652653841</w:t>
+            </w:r>
+          </w:p>
+        </w:tc>
+        <w:tc>
+          <w:tcPr>
+            <w:tcW w:type="dxa" w:w="1512"/>
+          </w:tcPr>
+          <w:p>
+            <w:r>
+              <w:t>645.5585666255632</w:t>
+            </w:r>
+          </w:p>
+        </w:tc>
+      </w:tr>
+      <w:tr>
+        <w:tc>
+          <w:tcPr>
+            <w:tcW w:type="dxa" w:w="1512"/>
+          </w:tcPr>
+          <w:p>
+            <w:r>
+              <w:t>original</w:t>
+            </w:r>
+          </w:p>
+        </w:tc>
+        <w:tc>
+          <w:tcPr>
+            <w:tcW w:type="dxa" w:w="1512"/>
+          </w:tcPr>
+          <w:p>
+            <w:r>
+              <w:t>charging_time</w:t>
+            </w:r>
+          </w:p>
+        </w:tc>
+        <w:tc>
+          <w:tcPr>
+            <w:tcW w:type="dxa" w:w="1512"/>
+          </w:tcPr>
+          <w:p>
+            <w:r>
+              <w:t>12</w:t>
+            </w:r>
+          </w:p>
+        </w:tc>
+        <w:tc>
+          <w:tcPr>
+            <w:tcW w:type="dxa" w:w="1512"/>
+          </w:tcPr>
+          <w:p>
+            <w:r>
+              <w:t>372.3596962339234</w:t>
+            </w:r>
+          </w:p>
+        </w:tc>
+        <w:tc>
+          <w:tcPr>
+            <w:tcW w:type="dxa" w:w="1512"/>
+          </w:tcPr>
+          <w:p>
+            <w:r>
+              <w:t>45.480718365574525</w:t>
+            </w:r>
+          </w:p>
+        </w:tc>
+        <w:tc>
+          <w:tcPr>
+            <w:tcW w:type="dxa" w:w="1512"/>
+          </w:tcPr>
+          <w:p>
+            <w:r>
+              <w:t>864.590512477108</w:t>
+            </w:r>
+          </w:p>
+        </w:tc>
+      </w:tr>
+      <w:tr>
+        <w:tc>
+          <w:tcPr>
+            <w:tcW w:type="dxa" w:w="1512"/>
+          </w:tcPr>
+          <w:p>
+            <w:r>
+              <w:t>original</w:t>
+            </w:r>
+          </w:p>
+        </w:tc>
+        <w:tc>
+          <w:tcPr>
+            <w:tcW w:type="dxa" w:w="1512"/>
+          </w:tcPr>
+          <w:p>
+            <w:r>
+              <w:t>station_waiting</w:t>
+            </w:r>
+          </w:p>
+        </w:tc>
+        <w:tc>
+          <w:tcPr>
+            <w:tcW w:type="dxa" w:w="1512"/>
+          </w:tcPr>
+          <w:p>
+            <w:r>
+              <w:t>12</w:t>
+            </w:r>
+          </w:p>
+        </w:tc>
+        <w:tc>
+          <w:tcPr>
+            <w:tcW w:type="dxa" w:w="1512"/>
+          </w:tcPr>
+          <w:p>
+            <w:r>
+              <w:t>23.199459433555603</w:t>
+            </w:r>
+          </w:p>
+        </w:tc>
+        <w:tc>
+          <w:tcPr>
+            <w:tcW w:type="dxa" w:w="1512"/>
+          </w:tcPr>
+          <w:p>
+            <w:r>
+              <w:t>1.828314224878947</w:t>
+            </w:r>
+          </w:p>
+        </w:tc>
+        <w:tc>
+          <w:tcPr>
+            <w:tcW w:type="dxa" w:w="1512"/>
+          </w:tcPr>
+          <w:p>
+            <w:r>
+              <w:t>57.737914284070335</w:t>
+            </w:r>
+          </w:p>
+        </w:tc>
+      </w:tr>
+      <w:tr>
+        <w:tc>
+          <w:tcPr>
+            <w:tcW w:type="dxa" w:w="1512"/>
+          </w:tcPr>
+          <w:p>
+            <w:r>
+              <w:t>original</w:t>
+            </w:r>
+          </w:p>
+        </w:tc>
+        <w:tc>
+          <w:tcPr>
+            <w:tcW w:type="dxa" w:w="1512"/>
+          </w:tcPr>
+          <w:p>
+            <w:r>
+              <w:t>duration</w:t>
+            </w:r>
+          </w:p>
+        </w:tc>
+        <w:tc>
+          <w:tcPr>
+            <w:tcW w:type="dxa" w:w="1512"/>
+          </w:tcPr>
+          <w:p>
+            <w:r>
+              <w:t>12</w:t>
+            </w:r>
+          </w:p>
+        </w:tc>
+        <w:tc>
+          <w:tcPr>
+            <w:tcW w:type="dxa" w:w="1512"/>
+          </w:tcPr>
+          <w:p>
+            <w:r>
+              <w:t>119.66591312843472</w:t>
+            </w:r>
+          </w:p>
+        </w:tc>
+        <w:tc>
+          <w:tcPr>
+            <w:tcW w:type="dxa" w:w="1512"/>
+          </w:tcPr>
+          <w:p>
+            <w:r>
+              <w:t>0.0</w:t>
+            </w:r>
+          </w:p>
+        </w:tc>
+        <w:tc>
+          <w:tcPr>
+            <w:tcW w:type="dxa" w:w="1512"/>
+          </w:tcPr>
+          <w:p>
+            <w:r>
+              <w:t>358.99773938530416</w:t>
+            </w:r>
+          </w:p>
+        </w:tc>
+      </w:tr>
+      <w:tr>
+        <w:tc>
+          <w:tcPr>
+            <w:tcW w:type="dxa" w:w="1512"/>
+          </w:tcPr>
+          <w:p>
+            <w:r>
+              <w:t>relaxed</w:t>
+            </w:r>
+          </w:p>
+        </w:tc>
+        <w:tc>
+          <w:tcPr>
+            <w:tcW w:type="dxa" w:w="1512"/>
+          </w:tcPr>
+          <w:p>
+            <w:r>
+              <w:t>charged_energy</w:t>
+            </w:r>
+          </w:p>
+        </w:tc>
+        <w:tc>
+          <w:tcPr>
+            <w:tcW w:type="dxa" w:w="1512"/>
+          </w:tcPr>
+          <w:p>
+            <w:r>
+              <w:t>21</w:t>
+            </w:r>
+          </w:p>
+        </w:tc>
+        <w:tc>
+          <w:tcPr>
+            <w:tcW w:type="dxa" w:w="1512"/>
+          </w:tcPr>
+          <w:p>
+            <w:r>
+              <w:t>429.9429332674169</w:t>
+            </w:r>
+          </w:p>
+        </w:tc>
+        <w:tc>
+          <w:tcPr>
+            <w:tcW w:type="dxa" w:w="1512"/>
+          </w:tcPr>
+          <w:p>
+            <w:r>
+              <w:t>0.0</w:t>
+            </w:r>
+          </w:p>
+        </w:tc>
+        <w:tc>
+          <w:tcPr>
+            <w:tcW w:type="dxa" w:w="1512"/>
+          </w:tcPr>
+          <w:p>
+            <w:r>
+              <w:t>946.8784530795803</w:t>
+            </w:r>
+          </w:p>
+        </w:tc>
+      </w:tr>
+      <w:tr>
+        <w:tc>
+          <w:tcPr>
+            <w:tcW w:type="dxa" w:w="1512"/>
+          </w:tcPr>
+          <w:p>
+            <w:r>
+              <w:t>relaxed</w:t>
+            </w:r>
+          </w:p>
+        </w:tc>
+        <w:tc>
+          <w:tcPr>
+            <w:tcW w:type="dxa" w:w="1512"/>
+          </w:tcPr>
+          <w:p>
+            <w:r>
+              <w:t>charging_expense</w:t>
+            </w:r>
+          </w:p>
+        </w:tc>
+        <w:tc>
+          <w:tcPr>
+            <w:tcW w:type="dxa" w:w="1512"/>
+          </w:tcPr>
+          <w:p>
+            <w:r>
+              <w:t>21</w:t>
+            </w:r>
+          </w:p>
+        </w:tc>
+        <w:tc>
+          <w:tcPr>
+            <w:tcW w:type="dxa" w:w="1512"/>
+          </w:tcPr>
+          <w:p>
+            <w:r>
+              <w:t>242.43757355614815</w:t>
+            </w:r>
+          </w:p>
+        </w:tc>
+        <w:tc>
+          <w:tcPr>
+            <w:tcW w:type="dxa" w:w="1512"/>
+          </w:tcPr>
+          <w:p>
+            <w:r>
+              <w:t>0.060232500731563915</w:t>
+            </w:r>
+          </w:p>
+        </w:tc>
+        <w:tc>
+          <w:tcPr>
+            <w:tcW w:type="dxa" w:w="1512"/>
+          </w:tcPr>
+          <w:p>
+            <w:r>
+              <w:t>519.8685952976127</w:t>
+            </w:r>
+          </w:p>
+        </w:tc>
+      </w:tr>
+      <w:tr>
+        <w:tc>
+          <w:tcPr>
+            <w:tcW w:type="dxa" w:w="1512"/>
+          </w:tcPr>
+          <w:p>
+            <w:r>
+              <w:t>relaxed</w:t>
+            </w:r>
+          </w:p>
+        </w:tc>
+        <w:tc>
+          <w:tcPr>
+            <w:tcW w:type="dxa" w:w="1512"/>
+          </w:tcPr>
+          <w:p>
+            <w:r>
+              <w:t>charging_time</w:t>
+            </w:r>
+          </w:p>
+        </w:tc>
+        <w:tc>
+          <w:tcPr>
+            <w:tcW w:type="dxa" w:w="1512"/>
+          </w:tcPr>
+          <w:p>
+            <w:r>
+              <w:t>21</w:t>
+            </w:r>
+          </w:p>
+        </w:tc>
+        <w:tc>
+          <w:tcPr>
+            <w:tcW w:type="dxa" w:w="1512"/>
+          </w:tcPr>
+          <w:p>
+            <w:r>
+              <w:t>358.2908302559749</w:t>
+            </w:r>
+          </w:p>
+        </w:tc>
+        <w:tc>
+          <w:tcPr>
+            <w:tcW w:type="dxa" w:w="1512"/>
+          </w:tcPr>
+          <w:p>
+            <w:r>
+              <w:t>-0.06632249882213295</w:t>
+            </w:r>
+          </w:p>
+        </w:tc>
+        <w:tc>
+          <w:tcPr>
+            <w:tcW w:type="dxa" w:w="1512"/>
+          </w:tcPr>
+          <w:p>
+            <w:r>
+              <w:t>791.0047878115116</w:t>
+            </w:r>
+          </w:p>
+        </w:tc>
+      </w:tr>
+      <w:tr>
+        <w:tc>
+          <w:tcPr>
+            <w:tcW w:type="dxa" w:w="1512"/>
+          </w:tcPr>
+          <w:p>
+            <w:r>
+              <w:t>relaxed</w:t>
+            </w:r>
+          </w:p>
+        </w:tc>
+        <w:tc>
+          <w:tcPr>
+            <w:tcW w:type="dxa" w:w="1512"/>
+          </w:tcPr>
+          <w:p>
+            <w:r>
+              <w:t>station_waiting</w:t>
+            </w:r>
+          </w:p>
+        </w:tc>
+        <w:tc>
+          <w:tcPr>
+            <w:tcW w:type="dxa" w:w="1512"/>
+          </w:tcPr>
+          <w:p>
+            <w:r>
+              <w:t>21</w:t>
+            </w:r>
+          </w:p>
+        </w:tc>
+        <w:tc>
+          <w:tcPr>
+            <w:tcW w:type="dxa" w:w="1512"/>
+          </w:tcPr>
+          <w:p>
+            <w:r>
+              <w:t>18.12107827549889</w:t>
+            </w:r>
+          </w:p>
+        </w:tc>
+        <w:tc>
+          <w:tcPr>
+            <w:tcW w:type="dxa" w:w="1512"/>
+          </w:tcPr>
+          <w:p>
+            <w:r>
+              <w:t>0.0</w:t>
+            </w:r>
+          </w:p>
+        </w:tc>
+        <w:tc>
+          <w:tcPr>
+            <w:tcW w:type="dxa" w:w="1512"/>
+          </w:tcPr>
+          <w:p>
+            <w:r>
+              <w:t>39.673133441380095</w:t>
+            </w:r>
+          </w:p>
+        </w:tc>
+      </w:tr>
+      <w:tr>
+        <w:tc>
+          <w:tcPr>
+            <w:tcW w:type="dxa" w:w="1512"/>
+          </w:tcPr>
+          <w:p>
+            <w:r>
+              <w:t>relaxed</w:t>
+            </w:r>
+          </w:p>
+        </w:tc>
+        <w:tc>
+          <w:tcPr>
+            <w:tcW w:type="dxa" w:w="1512"/>
+          </w:tcPr>
+          <w:p>
+            <w:r>
+              <w:t>duration</w:t>
+            </w:r>
+          </w:p>
+        </w:tc>
+        <w:tc>
+          <w:tcPr>
+            <w:tcW w:type="dxa" w:w="1512"/>
+          </w:tcPr>
+          <w:p>
+            <w:r>
+              <w:t>21</w:t>
+            </w:r>
+          </w:p>
+        </w:tc>
+        <w:tc>
+          <w:tcPr>
+            <w:tcW w:type="dxa" w:w="1512"/>
+          </w:tcPr>
+          <w:p>
+            <w:r>
+              <w:t>206.90305538787757</w:t>
+            </w:r>
+          </w:p>
+        </w:tc>
+        <w:tc>
+          <w:tcPr>
+            <w:tcW w:type="dxa" w:w="1512"/>
+          </w:tcPr>
+          <w:p>
+            <w:r>
+              <w:t>-2.5164071718754712</w:t>
+            </w:r>
+          </w:p>
+        </w:tc>
+        <w:tc>
+          <w:tcPr>
+            <w:tcW w:type="dxa" w:w="1512"/>
+          </w:tcPr>
+          <w:p>
+            <w:r>
+              <w:t>468.939207850839</w:t>
+            </w:r>
+          </w:p>
+        </w:tc>
+      </w:tr>
+    </w:tbl>
+    <w:p>
+      <w:r/>
+    </w:p>
+    <w:p>
+      <w:r>
+        <w:t>The supplementary tables above summarize Schneider feasibility, FR/PR time-budget convergence, HCO outcome counts, energy accounting, and the controlled fixed-route recharge-policy experiment. They support—but do not replace—the primary Hanif five-seed Results figures and Table 3.</w:t>
+      </w:r>
+    </w:p>
+    <w:p>
       <w:pPr>
         <w:pStyle w:val="Paragraphedeliste"/>
         <w:numPr>
@@ -30268,29 +34299,25 @@
           <w:rFonts w:ascii="Times New Roman" w:hAnsi="Times New Roman" w:cs="Times New Roman"/>
           <w:lang w:val="en-US"/>
         </w:rPr>
-        <w:t xml:space="preserve">The results show that partial recharging provides the largest and most consistent operational benefit. Compared with full recharging, ALNS-PR substantially reduces charged energy, charging time, and charging expense under both Original and Relaxed time windows. This confirms that avoiding unnecessary full charges is more important than simply changing the charging station, especially when route feasibility can be preserved with smaller energy amounts [8,21]. The effect of heterogeneous charging information is more limited. On fixed customer routes, HCO-Heterogeneous slightly reduces expected charging expense and station waiting under Original TW, but the effect appears in only a small number of instances and </w:t>
-      </w:r>
-      <w:r>
-        <w:rPr>
-          <w:rFonts w:ascii="Times New Roman" w:hAnsi="Times New Roman" w:cs="Times New Roman"/>
-          <w:lang w:val="en-US"/>
-        </w:rPr>
-        <w:lastRenderedPageBreak/>
-        <w:t>disappears under Relaxed TW. The station-level results also show a clear trade-off</w:t>
-      </w:r>
-      <w:r>
-        <w:rPr>
-          <w:rFonts w:ascii="Times New Roman" w:hAnsi="Times New Roman" w:cs="Times New Roman"/>
-          <w:lang w:val="en-US"/>
-        </w:rPr>
-        <w:t>,</w:t>
-      </w:r>
-      <w:r>
-        <w:rPr>
-          <w:rFonts w:ascii="Times New Roman" w:hAnsi="Times New Roman" w:cs="Times New Roman"/>
-          <w:lang w:val="en-US"/>
-        </w:rPr>
-        <w:t xml:space="preserve"> heterogeneous HCO selects stations with slightly lower expected price and waiting time, but these stations are not necessarily faster. Therefore, considering station heterogeneity can improve some charging decisions, but it does not guarantee simultaneous improvements in price, waiting, charging time, and distance. This behavior is consistent with previous studies showing that charging price, waiting, charging technology, and route structure may create competing decisions [10,15,25].</w:t>
+        <w:t>The results show that partial recharging provides the largest and most consistent operational benefit in charging metrics. Compared with full recharging under the primary ALNS comparison, ALNS-PR substantially reduces charged energy, charging time, and charging expense, while distance and propulsion energy can increase. Because FR and PR also differ in search operators, a separate fixed-route full-versus-partial recharge experiment was used to isolate charging quantity: among 240 seed-0/1 Phase-I archives, 198 become infeasible under forced full recharge (counterfactual TW/horizon), and 42 remain both-feasible for matched differences.</w:t>
+      </w:r>
+      <w:r>
+        <w:rPr>
+          <w:rFonts w:ascii="Times New Roman" w:hAnsi="Times New Roman" w:cs="Times New Roman"/>
+          <w:lang w:val="en-US"/>
+        </w:rPr>
+      </w:r>
+      <w:r>
+        <w:rPr>
+          <w:rFonts w:ascii="Times New Roman" w:hAnsi="Times New Roman" w:cs="Times New Roman"/>
+          <w:lang w:val="en-US"/>
+        </w:rPr>
+      </w:r>
+      <w:r>
+        <w:rPr>
+          <w:rFonts w:ascii="Times New Roman" w:hAnsi="Times New Roman" w:cs="Times New Roman"/>
+          <w:lang w:val="en-US"/>
+        </w:rPr>
       </w:r>
     </w:p>
     <w:p>
@@ -30306,7 +34333,7 @@
           <w:rFonts w:ascii="Times New Roman" w:hAnsi="Times New Roman" w:cs="Times New Roman"/>
           <w:lang w:val="en-US"/>
         </w:rPr>
-        <w:t xml:space="preserve">The Phase-II experiments further show that the value of HCO depends strongly on the structure of the instance. Compared with the matched </w:t>
+        <w:t>The Phase-II experiments further show that the value of HCO depends strongly on instance structure. Relative to matched PhaseII-NoHCO, heterogeneous HCO yields a favorable mean charging-expense change that is concentrated mainly in Original-TW C1, while many runs are unchanged and a non-trivial minority worsen. HCO is therefore not claimed as broadly superior.</w:t>
       </w:r>
       <w:proofErr w:type="spellStart"/>
       <w:r>
@@ -30314,7 +34341,6 @@
           <w:rFonts w:ascii="Times New Roman" w:hAnsi="Times New Roman" w:cs="Times New Roman"/>
           <w:lang w:val="en-US"/>
         </w:rPr>
-        <w:t>PhaseII-NoHCO</w:t>
       </w:r>
       <w:proofErr w:type="spellEnd"/>
       <w:r>
@@ -30322,7 +34348,6 @@
           <w:rFonts w:ascii="Times New Roman" w:hAnsi="Times New Roman" w:cs="Times New Roman"/>
           <w:lang w:val="en-US"/>
         </w:rPr>
-        <w:t xml:space="preserve"> control, heterogeneous HCO produces a favorable mean change under Original TW, but the improvement is concentrated in a limited number of instances, especially the C1 family, while many instances show no change or even a small deterioration. Under Relaxed TW, the benefit is almost absent. This suggests that charging-aware rerouting is most useful when tighter routing and time-window structures restrict the available charging choices and make station selection more important. </w:t>
       </w:r>
       <w:proofErr w:type="gramStart"/>
       <w:r>
@@ -30330,7 +34355,6 @@
           <w:rFonts w:ascii="Times New Roman" w:hAnsi="Times New Roman" w:cs="Times New Roman"/>
           <w:lang w:val="en-US"/>
         </w:rPr>
-        <w:t>The study</w:t>
       </w:r>
       <w:proofErr w:type="gramEnd"/>
       <w:r>
@@ -30338,7 +34362,6 @@
           <w:rFonts w:ascii="Times New Roman" w:hAnsi="Times New Roman" w:cs="Times New Roman"/>
           <w:lang w:val="en-US"/>
         </w:rPr>
-        <w:t xml:space="preserve"> also has some limitations. HCO is a deterministic heuristic rather than an exact charging optimizer, expected price and waiting time are used instead of stochastic realizations, and nonlinear charging curves and station-capacity interactions are not modeled. Future work could therefore examine stronger route-level charging optimization, adaptive allocation of search time between the two phases, nonlinear charging functions, stochastic station conditions, and capacitated charging stations.</w:t>
       </w:r>
     </w:p>
     <w:p>
@@ -30379,7 +34402,7 @@
           <w:rFonts w:ascii="Times New Roman" w:hAnsi="Times New Roman" w:cs="Times New Roman"/>
           <w:lang w:val="en-US"/>
         </w:rPr>
-        <w:t>This paper studied the EVRPTW with heterogeneous charging-station conditions and proposed a two-phase ALNS-HCO framework that combines partial recharging with fixed-fleet charging-aware route improvement. Phase I uses ALNS with partial recharging to determine a strong routing solution and fleet size, while Phase II keeps this fleet fixed and uses a Heterogeneous Charging Oracle to evaluate station choice and charging quantities using expected price, expected waiting time, charging rate, and route feasibility. The method was evaluated on 120 Hanif instances with 1,000 customers under Original and Relaxed time windows. The results show that partial recharging provides the largest and most consistent benefit by reducing charged energy, charging time, and charging expense. Heterogeneous charging information provides a smaller and more selective effect. On identical fixed routes, it slightly improves charging expense and expected waiting under Original TW, while the matched Phase-II analysis shows that larger benefits are concentrated mainly in the C1 family. Under Relaxed TW, the effect is weak or absent. Overall, the study shows that recharge quantity, heterogeneous station information, and charging-aware rerouting should be evaluated separately because they contribute differently to solution performance. Future research can extend the framework with stronger charging optimization, nonlinear charging, stochastic station conditions, adaptive phase budgets, and charging-station capacity constraints.</w:t>
+        <w:t>This paper studied the EVRPTW with heterogeneous charging-station conditions and proposed a two-phase ALNS-HCO framework that combines partial recharging with fixed-fleet charging-aware route improvement. Phase I uses ALNS with partial recharging to determine a strong routing solution and fleet size, while Phase II keeps this fleet fixed and uses a Heterogeneous Charging Oracle to evaluate station choice and charging quantities using expected price, expected waiting time, charging rate, and route feasibility. The method was evaluated on 120 Hanif instances with 1,000 customers under Original and Relaxed time windows. The results show that partial recharging provides the largest and most consistent benefit by reducing charged energy, charging time, and charging expense. Heterogeneous charging information provides a smaller and more selective effect. On identical fixed routes, it slightly improves charging expense and expected waiting under Original TW, while the matched Phase-II analysis shows that larger benefits are concentrated mainly in the C1 family. Under Relaxed TW, the effect is weak or absent. Overall, the study shows that recharge quantity, heterogeneous station information, and charging-aware rerouting should be evaluated separately because they contribute differently to solution performance. Future research can extend the framework with stronger charging optimization, nonlinear charging, stochastic station conditions, adaptive phase budgets, and charging-station capacity constraints. Independent Schneider EVRPTW validation on 56 large instances yields 264/336 feasible 30-second attempts; 12 instances remain unsolved with one repeatedly missing customer (C65/C64/C75), classified as a search limitation after full source-matrix fidelity checks. Published BKS numerical gaps are not claimed under mismatched distance-rounding conventions.</w:t>
       </w:r>
     </w:p>
     <w:p>

</xml_diff>